<commit_message>
Parte Individual 1.2 Isabel Alvarado
</commit_message>
<xml_diff>
--- a/Fase 1/Evidencias Individuales/Alvarado_Isabel_1.2_APT122_DiarioReflexionFase1.docx
+++ b/Fase 1/Evidencias Individuales/Alvarado_Isabel_1.2_APT122_DiarioReflexionFase1.docx
@@ -1,6 +1,6 @@
 
 <file path=word/document.xml><?xml version="1.0" encoding="utf-8"?>
-<w:document xmlns:wpc="http://schemas.microsoft.com/office/word/2010/wordprocessingCanvas" xmlns:cx="http://schemas.microsoft.com/office/drawing/2014/chartex" xmlns:mc="http://schemas.openxmlformats.org/markup-compatibility/2006" xmlns:o="urn:schemas-microsoft-com:office:office" xmlns:r="http://schemas.openxmlformats.org/officeDocument/2006/relationships" xmlns:m="http://schemas.openxmlformats.org/officeDocument/2006/math" xmlns:v="urn:schemas-microsoft-com:vml" xmlns:wp14="http://schemas.microsoft.com/office/word/2010/wordprocessingDrawing" xmlns:wp="http://schemas.openxmlformats.org/drawingml/2006/wordprocessingDrawing" xmlns:w10="urn:schemas-microsoft-com:office:word" xmlns:w="http://schemas.openxmlformats.org/wordprocessingml/2006/main" xmlns:w14="http://schemas.microsoft.com/office/word/2010/wordml" xmlns:w15="http://schemas.microsoft.com/office/word/2012/wordml" xmlns:w16se="http://schemas.microsoft.com/office/word/2015/wordml/symex" xmlns:wpg="http://schemas.microsoft.com/office/word/2010/wordprocessingGroup" xmlns:wpi="http://schemas.microsoft.com/office/word/2010/wordprocessingInk" xmlns:wne="http://schemas.microsoft.com/office/word/2006/wordml" xmlns:wps="http://schemas.microsoft.com/office/word/2010/wordprocessingShape" mc:Ignorable="w14 w15 w16se wp14">
+<w:document xmlns:wpc="http://schemas.microsoft.com/office/word/2010/wordprocessingCanvas" xmlns:cx="http://schemas.microsoft.com/office/drawing/2014/chartex" xmlns:cx1="http://schemas.microsoft.com/office/drawing/2015/9/8/chartex" xmlns:cx2="http://schemas.microsoft.com/office/drawing/2015/10/21/chartex" xmlns:cx3="http://schemas.microsoft.com/office/drawing/2016/5/9/chartex" xmlns:cx4="http://schemas.microsoft.com/office/drawing/2016/5/10/chartex" xmlns:cx5="http://schemas.microsoft.com/office/drawing/2016/5/11/chartex" xmlns:cx6="http://schemas.microsoft.com/office/drawing/2016/5/12/chartex" xmlns:cx7="http://schemas.microsoft.com/office/drawing/2016/5/13/chartex" xmlns:cx8="http://schemas.microsoft.com/office/drawing/2016/5/14/chartex" xmlns:mc="http://schemas.openxmlformats.org/markup-compatibility/2006" xmlns:aink="http://schemas.microsoft.com/office/drawing/2016/ink" xmlns:am3d="http://schemas.microsoft.com/office/drawing/2017/model3d" xmlns:o="urn:schemas-microsoft-com:office:office" xmlns:oel="http://schemas.microsoft.com/office/2019/extlst" xmlns:r="http://schemas.openxmlformats.org/officeDocument/2006/relationships" xmlns:m="http://schemas.openxmlformats.org/officeDocument/2006/math" xmlns:v="urn:schemas-microsoft-com:vml" xmlns:wp14="http://schemas.microsoft.com/office/word/2010/wordprocessingDrawing" xmlns:wp="http://schemas.openxmlformats.org/drawingml/2006/wordprocessingDrawing" xmlns:w10="urn:schemas-microsoft-com:office:word" xmlns:w="http://schemas.openxmlformats.org/wordprocessingml/2006/main" xmlns:w14="http://schemas.microsoft.com/office/word/2010/wordml" xmlns:w15="http://schemas.microsoft.com/office/word/2012/wordml" xmlns:w16cex="http://schemas.microsoft.com/office/word/2018/wordml/cex" xmlns:w16cid="http://schemas.microsoft.com/office/word/2016/wordml/cid" xmlns:w16="http://schemas.microsoft.com/office/word/2018/wordml" xmlns:w16sdtdh="http://schemas.microsoft.com/office/word/2020/wordml/sdtdatahash" xmlns:w16se="http://schemas.microsoft.com/office/word/2015/wordml/symex" xmlns:wpg="http://schemas.microsoft.com/office/word/2010/wordprocessingGroup" xmlns:wpi="http://schemas.microsoft.com/office/word/2010/wordprocessingInk" xmlns:wne="http://schemas.microsoft.com/office/word/2006/wordml" xmlns:wps="http://schemas.microsoft.com/office/word/2010/wordprocessingShape" mc:Ignorable="w14 w15 w16se w16cid w16 w16cex w16sdtdh wp14">
   <w:body>
     <w:p/>
     <w:tbl>
@@ -369,6 +369,53 @@
                 <w:szCs w:val="24"/>
               </w:rPr>
             </w:pPr>
+            <w:r>
+              <w:rPr>
+                <w:rFonts w:eastAsiaTheme="majorEastAsia"/>
+                <w:color w:val="767171" w:themeColor="background2" w:themeShade="80"/>
+                <w:sz w:val="24"/>
+                <w:szCs w:val="24"/>
+              </w:rPr>
+              <w:t>Me gust</w:t>
+            </w:r>
+            <w:r>
+              <w:rPr>
+                <w:rFonts w:eastAsiaTheme="majorEastAsia"/>
+                <w:color w:val="767171" w:themeColor="background2" w:themeShade="80"/>
+                <w:sz w:val="24"/>
+                <w:szCs w:val="24"/>
+              </w:rPr>
+              <w:t xml:space="preserve">aron las asignaturas de Big Data y Minería de Datos me mostraron un área a la que me dedicaría en el futuro. Lo que más me gusto fue analizar grandes volúmenes de datos y tomar decisiones de negocio en base a la limpieza análisis de los </w:t>
+            </w:r>
+            <w:proofErr w:type="spellStart"/>
+            <w:r>
+              <w:rPr>
+                <w:rFonts w:eastAsiaTheme="majorEastAsia"/>
+                <w:color w:val="767171" w:themeColor="background2" w:themeShade="80"/>
+                <w:sz w:val="24"/>
+                <w:szCs w:val="24"/>
+              </w:rPr>
+              <w:t>dataset</w:t>
+            </w:r>
+            <w:proofErr w:type="spellEnd"/>
+            <w:r>
+              <w:rPr>
+                <w:rFonts w:eastAsiaTheme="majorEastAsia"/>
+                <w:color w:val="767171" w:themeColor="background2" w:themeShade="80"/>
+                <w:sz w:val="24"/>
+                <w:szCs w:val="24"/>
+              </w:rPr>
+              <w:t>.</w:t>
+            </w:r>
+            <w:r>
+              <w:rPr>
+                <w:rFonts w:eastAsiaTheme="majorEastAsia"/>
+                <w:color w:val="767171" w:themeColor="background2" w:themeShade="80"/>
+                <w:sz w:val="24"/>
+                <w:szCs w:val="24"/>
+              </w:rPr>
+              <w:t xml:space="preserve"> Todas las materias de Inteligencia de negocio me llamaron mucho la atención.</w:t>
+            </w:r>
           </w:p>
           <w:p>
             <w:pPr>
@@ -441,6 +488,15 @@
                 <w:szCs w:val="24"/>
               </w:rPr>
             </w:pPr>
+            <w:r>
+              <w:rPr>
+                <w:rFonts w:eastAsiaTheme="majorEastAsia"/>
+                <w:color w:val="767171" w:themeColor="background2" w:themeShade="80"/>
+                <w:sz w:val="24"/>
+                <w:szCs w:val="24"/>
+              </w:rPr>
+              <w:t>Si, ya que es un plus para la línea de especialización que escogí, es un aporte en la gestión de proyectos una diferenciación dentro de las posibilidades de desarrollar mi carrera profesional.</w:t>
+            </w:r>
           </w:p>
           <w:p>
             <w:pPr>
@@ -641,7 +697,6 @@
                 <w:sz w:val="24"/>
                 <w:szCs w:val="24"/>
               </w:rPr>
-              <w:lastRenderedPageBreak/>
               <w:t xml:space="preserve">2. Revisa las competencias y unidades de competencias correspondientes a cada asignatura de la malla de tu carrera. Marca en </w:t>
             </w:r>
             <w:r>
@@ -779,11 +834,76 @@
               <w:jc w:val="both"/>
               <w:rPr>
                 <w:rFonts w:eastAsiaTheme="majorEastAsia"/>
-                <w:color w:val="767171" w:themeColor="background2" w:themeShade="80"/>
-                <w:sz w:val="24"/>
-                <w:szCs w:val="24"/>
-              </w:rPr>
-            </w:pPr>
+                <w:color w:val="FF0000"/>
+                <w:sz w:val="24"/>
+                <w:szCs w:val="24"/>
+              </w:rPr>
+            </w:pPr>
+            <w:r>
+              <w:rPr>
+                <w:rFonts w:eastAsiaTheme="majorEastAsia"/>
+                <w:color w:val="70AD47" w:themeColor="accent6"/>
+                <w:sz w:val="24"/>
+                <w:szCs w:val="24"/>
+              </w:rPr>
+              <w:t>Evaluar y gestionar proyectos en su área de especialización profesional, durante todo el ciclo de vida, de acuerdo a buenas prácticas y utilizando metodologías y herramientas de software, para cumplir con los requerimientos de la organización en contextos tradicionales y ágiles.</w:t>
+            </w:r>
+            <w:r>
+              <w:rPr>
+                <w:rFonts w:eastAsiaTheme="majorEastAsia"/>
+                <w:color w:val="70AD47" w:themeColor="accent6"/>
+                <w:sz w:val="24"/>
+                <w:szCs w:val="24"/>
+              </w:rPr>
+              <w:t xml:space="preserve"> Encuentro que en esta competencia me destaco porqué tengo facilidad a la hora de organizar y trabajar en equipo. En cuanto a la competencia </w:t>
+            </w:r>
+            <w:r>
+              <w:rPr>
+                <w:rFonts w:eastAsiaTheme="majorEastAsia"/>
+                <w:color w:val="FF0000"/>
+                <w:sz w:val="24"/>
+                <w:szCs w:val="24"/>
+              </w:rPr>
+              <w:t>Diseñar y generar soluciones que permitan resolver los requerimientos de información en el contexto de las organizaciones, considerando bases de datos relacionales y no relacionales.</w:t>
+            </w:r>
+            <w:r>
+              <w:rPr>
+                <w:rFonts w:eastAsiaTheme="majorEastAsia"/>
+                <w:color w:val="FF0000"/>
+                <w:sz w:val="24"/>
+                <w:szCs w:val="24"/>
+              </w:rPr>
+              <w:t xml:space="preserve"> Aunque si puedo realizar consultas a Base de datos y el uso de esto en entorno empresariales es más simple que el </w:t>
+            </w:r>
+            <w:proofErr w:type="spellStart"/>
+            <w:r>
+              <w:rPr>
+                <w:rFonts w:eastAsiaTheme="majorEastAsia"/>
+                <w:color w:val="FF0000"/>
+                <w:sz w:val="24"/>
+                <w:szCs w:val="24"/>
+              </w:rPr>
+              <w:t>frontend</w:t>
+            </w:r>
+            <w:proofErr w:type="spellEnd"/>
+            <w:r>
+              <w:rPr>
+                <w:rFonts w:eastAsiaTheme="majorEastAsia"/>
+                <w:color w:val="FF0000"/>
+                <w:sz w:val="24"/>
+                <w:szCs w:val="24"/>
+              </w:rPr>
+              <w:t xml:space="preserve"> no tengo</w:t>
+            </w:r>
+            <w:r>
+              <w:rPr>
+                <w:rFonts w:eastAsiaTheme="majorEastAsia"/>
+                <w:color w:val="FF0000"/>
+                <w:sz w:val="24"/>
+                <w:szCs w:val="24"/>
+              </w:rPr>
+              <w:t xml:space="preserve"> interés en basar mi carrera en esa línea nunca estaré exenta de usarla.</w:t>
+            </w:r>
           </w:p>
           <w:p>
             <w:pPr>
@@ -1242,6 +1362,15 @@
                 <w:szCs w:val="24"/>
               </w:rPr>
             </w:pPr>
+            <w:r>
+              <w:rPr>
+                <w:rFonts w:eastAsiaTheme="majorEastAsia"/>
+                <w:color w:val="767171" w:themeColor="background2" w:themeShade="80"/>
+                <w:sz w:val="24"/>
+                <w:szCs w:val="24"/>
+              </w:rPr>
+              <w:t>Me interesa ser producto manager por lo tanto la línea de gestión de proyectos es una de las que más me interesa. Mi segunda opción sería Big Data la línea de análisis de datos igual es de mi interés.</w:t>
+            </w:r>
           </w:p>
           <w:p>
             <w:pPr>
@@ -1368,6 +1497,35 @@
                 <w:szCs w:val="24"/>
               </w:rPr>
             </w:pPr>
+            <w:r>
+              <w:rPr>
+                <w:rFonts w:eastAsiaTheme="majorEastAsia"/>
+                <w:color w:val="767171" w:themeColor="background2" w:themeShade="80"/>
+                <w:sz w:val="24"/>
+                <w:szCs w:val="24"/>
+              </w:rPr>
+              <w:t xml:space="preserve">Manejo de grupos de trabajos, uso de metodologías aptas para el proyecto en el que me estaré desenvolviendo. Cumplir con los requerimientos de los clientes y ver </w:t>
+            </w:r>
+            <w:proofErr w:type="spellStart"/>
+            <w:r>
+              <w:rPr>
+                <w:rFonts w:eastAsiaTheme="majorEastAsia"/>
+                <w:color w:val="767171" w:themeColor="background2" w:themeShade="80"/>
+                <w:sz w:val="24"/>
+                <w:szCs w:val="24"/>
+              </w:rPr>
+              <w:t>como</w:t>
+            </w:r>
+            <w:proofErr w:type="spellEnd"/>
+            <w:r>
+              <w:rPr>
+                <w:rFonts w:eastAsiaTheme="majorEastAsia"/>
+                <w:color w:val="767171" w:themeColor="background2" w:themeShade="80"/>
+                <w:sz w:val="24"/>
+                <w:szCs w:val="24"/>
+              </w:rPr>
+              <w:t xml:space="preserve"> se desarrollan cada una de las fases del desarrollo. La parte de la documentación inherente a esta especialización es lo único que me gustaría fortalecer.</w:t>
+            </w:r>
           </w:p>
           <w:p>
             <w:pPr>
@@ -1508,6 +1666,24 @@
                 <w:szCs w:val="24"/>
               </w:rPr>
             </w:pPr>
+            <w:r>
+              <w:rPr>
+                <w:rFonts w:eastAsiaTheme="majorEastAsia"/>
+                <w:color w:val="767171" w:themeColor="background2" w:themeShade="80"/>
+                <w:sz w:val="24"/>
+                <w:szCs w:val="24"/>
+              </w:rPr>
+              <w:t xml:space="preserve">Trabajar 3 años en mi empresa actual para juntar experiencia y luego migrar a una empresa multinacional para poder viajar y trabajar en otro país. Me veo trabajando </w:t>
+            </w:r>
+            <w:r>
+              <w:rPr>
+                <w:rFonts w:eastAsiaTheme="majorEastAsia"/>
+                <w:color w:val="767171" w:themeColor="background2" w:themeShade="80"/>
+                <w:sz w:val="24"/>
+                <w:szCs w:val="24"/>
+              </w:rPr>
+              <w:t>para una empresa con sede en otros países.</w:t>
+            </w:r>
           </w:p>
           <w:p>
             <w:pPr>
@@ -1743,8 +1919,6 @@
                 <w:szCs w:val="20"/>
               </w:rPr>
             </w:pPr>
-            <w:bookmarkStart w:id="0" w:name="_GoBack"/>
-            <w:bookmarkEnd w:id="0"/>
             <w:r>
               <w:rPr>
                 <w:rFonts w:eastAsiaTheme="majorEastAsia"/>
@@ -1831,6 +2005,35 @@
                 <w:szCs w:val="24"/>
               </w:rPr>
             </w:pPr>
+            <w:r>
+              <w:rPr>
+                <w:rFonts w:eastAsiaTheme="majorEastAsia"/>
+                <w:color w:val="767171" w:themeColor="background2" w:themeShade="80"/>
+                <w:sz w:val="24"/>
+                <w:szCs w:val="24"/>
+              </w:rPr>
+              <w:t xml:space="preserve">Si, el rol que asignamos para cada uno de los integrantes dentro del proyecto de título son las fortalezas que tenemos cada uno. Para que cada uno tenga un rol parecido a sus expectativas futuras. Si bien el </w:t>
+            </w:r>
+            <w:proofErr w:type="spellStart"/>
+            <w:r>
+              <w:rPr>
+                <w:rFonts w:eastAsiaTheme="majorEastAsia"/>
+                <w:color w:val="767171" w:themeColor="background2" w:themeShade="80"/>
+                <w:sz w:val="24"/>
+                <w:szCs w:val="24"/>
+              </w:rPr>
+              <w:t>backend</w:t>
+            </w:r>
+            <w:proofErr w:type="spellEnd"/>
+            <w:r>
+              <w:rPr>
+                <w:rFonts w:eastAsiaTheme="majorEastAsia"/>
+                <w:color w:val="767171" w:themeColor="background2" w:themeShade="80"/>
+                <w:sz w:val="24"/>
+                <w:szCs w:val="24"/>
+              </w:rPr>
+              <w:t xml:space="preserve"> es el fuerte de uno de los miembros la estructuración del proyecto igual permitirá que cada uno de nosotros ponga a prueba sus habilidades. La que más se relaciona es gestión de proyectos. Requiere ajustes ya que se debe ajustar a los tiempos de los miembros que deben hacer su práctica.</w:t>
+            </w:r>
           </w:p>
           <w:p>
             <w:pPr>
@@ -2213,7 +2416,7 @@
 </file>
 
 <file path=word/endnotes.xml><?xml version="1.0" encoding="utf-8"?>
-<w:endnotes xmlns:wpc="http://schemas.microsoft.com/office/word/2010/wordprocessingCanvas" xmlns:cx="http://schemas.microsoft.com/office/drawing/2014/chartex" xmlns:mc="http://schemas.openxmlformats.org/markup-compatibility/2006" xmlns:o="urn:schemas-microsoft-com:office:office" xmlns:r="http://schemas.openxmlformats.org/officeDocument/2006/relationships" xmlns:m="http://schemas.openxmlformats.org/officeDocument/2006/math" xmlns:v="urn:schemas-microsoft-com:vml" xmlns:wp14="http://schemas.microsoft.com/office/word/2010/wordprocessingDrawing" xmlns:wp="http://schemas.openxmlformats.org/drawingml/2006/wordprocessingDrawing" xmlns:w10="urn:schemas-microsoft-com:office:word" xmlns:w="http://schemas.openxmlformats.org/wordprocessingml/2006/main" xmlns:w14="http://schemas.microsoft.com/office/word/2010/wordml" xmlns:w15="http://schemas.microsoft.com/office/word/2012/wordml" xmlns:w16se="http://schemas.microsoft.com/office/word/2015/wordml/symex" xmlns:wpg="http://schemas.microsoft.com/office/word/2010/wordprocessingGroup" xmlns:wpi="http://schemas.microsoft.com/office/word/2010/wordprocessingInk" xmlns:wne="http://schemas.microsoft.com/office/word/2006/wordml" xmlns:wps="http://schemas.microsoft.com/office/word/2010/wordprocessingShape" mc:Ignorable="w14 w15 w16se wp14">
+<w:endnotes xmlns:wpc="http://schemas.microsoft.com/office/word/2010/wordprocessingCanvas" xmlns:cx="http://schemas.microsoft.com/office/drawing/2014/chartex" xmlns:cx1="http://schemas.microsoft.com/office/drawing/2015/9/8/chartex" xmlns:cx2="http://schemas.microsoft.com/office/drawing/2015/10/21/chartex" xmlns:cx3="http://schemas.microsoft.com/office/drawing/2016/5/9/chartex" xmlns:cx4="http://schemas.microsoft.com/office/drawing/2016/5/10/chartex" xmlns:cx5="http://schemas.microsoft.com/office/drawing/2016/5/11/chartex" xmlns:cx6="http://schemas.microsoft.com/office/drawing/2016/5/12/chartex" xmlns:cx7="http://schemas.microsoft.com/office/drawing/2016/5/13/chartex" xmlns:cx8="http://schemas.microsoft.com/office/drawing/2016/5/14/chartex" xmlns:mc="http://schemas.openxmlformats.org/markup-compatibility/2006" xmlns:aink="http://schemas.microsoft.com/office/drawing/2016/ink" xmlns:am3d="http://schemas.microsoft.com/office/drawing/2017/model3d" xmlns:o="urn:schemas-microsoft-com:office:office" xmlns:oel="http://schemas.microsoft.com/office/2019/extlst" xmlns:r="http://schemas.openxmlformats.org/officeDocument/2006/relationships" xmlns:m="http://schemas.openxmlformats.org/officeDocument/2006/math" xmlns:v="urn:schemas-microsoft-com:vml" xmlns:wp14="http://schemas.microsoft.com/office/word/2010/wordprocessingDrawing" xmlns:wp="http://schemas.openxmlformats.org/drawingml/2006/wordprocessingDrawing" xmlns:w10="urn:schemas-microsoft-com:office:word" xmlns:w="http://schemas.openxmlformats.org/wordprocessingml/2006/main" xmlns:w14="http://schemas.microsoft.com/office/word/2010/wordml" xmlns:w15="http://schemas.microsoft.com/office/word/2012/wordml" xmlns:w16cex="http://schemas.microsoft.com/office/word/2018/wordml/cex" xmlns:w16cid="http://schemas.microsoft.com/office/word/2016/wordml/cid" xmlns:w16="http://schemas.microsoft.com/office/word/2018/wordml" xmlns:w16sdtdh="http://schemas.microsoft.com/office/word/2020/wordml/sdtdatahash" xmlns:w16se="http://schemas.microsoft.com/office/word/2015/wordml/symex" xmlns:wpg="http://schemas.microsoft.com/office/word/2010/wordprocessingGroup" xmlns:wpi="http://schemas.microsoft.com/office/word/2010/wordprocessingInk" xmlns:wne="http://schemas.microsoft.com/office/word/2006/wordml" xmlns:wps="http://schemas.microsoft.com/office/word/2010/wordprocessingShape" mc:Ignorable="w14 w15 w16se w16cid w16 w16cex w16sdtdh wp14">
   <w:endnote w:type="separator" w:id="-1">
     <w:p>
       <w:pPr>
@@ -2238,7 +2441,7 @@
 </file>
 
 <file path=word/footer1.xml><?xml version="1.0" encoding="utf-8"?>
-<w:ftr xmlns:wpc="http://schemas.microsoft.com/office/word/2010/wordprocessingCanvas" xmlns:cx="http://schemas.microsoft.com/office/drawing/2014/chartex" xmlns:mc="http://schemas.openxmlformats.org/markup-compatibility/2006" xmlns:o="urn:schemas-microsoft-com:office:office" xmlns:r="http://schemas.openxmlformats.org/officeDocument/2006/relationships" xmlns:m="http://schemas.openxmlformats.org/officeDocument/2006/math" xmlns:v="urn:schemas-microsoft-com:vml" xmlns:wp14="http://schemas.microsoft.com/office/word/2010/wordprocessingDrawing" xmlns:wp="http://schemas.openxmlformats.org/drawingml/2006/wordprocessingDrawing" xmlns:w10="urn:schemas-microsoft-com:office:word" xmlns:w="http://schemas.openxmlformats.org/wordprocessingml/2006/main" xmlns:w14="http://schemas.microsoft.com/office/word/2010/wordml" xmlns:w15="http://schemas.microsoft.com/office/word/2012/wordml" xmlns:w16se="http://schemas.microsoft.com/office/word/2015/wordml/symex" xmlns:wpg="http://schemas.microsoft.com/office/word/2010/wordprocessingGroup" xmlns:wpi="http://schemas.microsoft.com/office/word/2010/wordprocessingInk" xmlns:wne="http://schemas.microsoft.com/office/word/2006/wordml" xmlns:wps="http://schemas.microsoft.com/office/word/2010/wordprocessingShape" mc:Ignorable="w14 w15 w16se wp14">
+<w:ftr xmlns:wpc="http://schemas.microsoft.com/office/word/2010/wordprocessingCanvas" xmlns:cx="http://schemas.microsoft.com/office/drawing/2014/chartex" xmlns:cx1="http://schemas.microsoft.com/office/drawing/2015/9/8/chartex" xmlns:cx2="http://schemas.microsoft.com/office/drawing/2015/10/21/chartex" xmlns:cx3="http://schemas.microsoft.com/office/drawing/2016/5/9/chartex" xmlns:cx4="http://schemas.microsoft.com/office/drawing/2016/5/10/chartex" xmlns:cx5="http://schemas.microsoft.com/office/drawing/2016/5/11/chartex" xmlns:cx6="http://schemas.microsoft.com/office/drawing/2016/5/12/chartex" xmlns:cx7="http://schemas.microsoft.com/office/drawing/2016/5/13/chartex" xmlns:cx8="http://schemas.microsoft.com/office/drawing/2016/5/14/chartex" xmlns:mc="http://schemas.openxmlformats.org/markup-compatibility/2006" xmlns:aink="http://schemas.microsoft.com/office/drawing/2016/ink" xmlns:am3d="http://schemas.microsoft.com/office/drawing/2017/model3d" xmlns:o="urn:schemas-microsoft-com:office:office" xmlns:oel="http://schemas.microsoft.com/office/2019/extlst" xmlns:r="http://schemas.openxmlformats.org/officeDocument/2006/relationships" xmlns:m="http://schemas.openxmlformats.org/officeDocument/2006/math" xmlns:v="urn:schemas-microsoft-com:vml" xmlns:wp14="http://schemas.microsoft.com/office/word/2010/wordprocessingDrawing" xmlns:wp="http://schemas.openxmlformats.org/drawingml/2006/wordprocessingDrawing" xmlns:w10="urn:schemas-microsoft-com:office:word" xmlns:w="http://schemas.openxmlformats.org/wordprocessingml/2006/main" xmlns:w14="http://schemas.microsoft.com/office/word/2010/wordml" xmlns:w15="http://schemas.microsoft.com/office/word/2012/wordml" xmlns:w16cex="http://schemas.microsoft.com/office/word/2018/wordml/cex" xmlns:w16cid="http://schemas.microsoft.com/office/word/2016/wordml/cid" xmlns:w16="http://schemas.microsoft.com/office/word/2018/wordml" xmlns:w16sdtdh="http://schemas.microsoft.com/office/word/2020/wordml/sdtdatahash" xmlns:w16se="http://schemas.microsoft.com/office/word/2015/wordml/symex" xmlns:wpg="http://schemas.microsoft.com/office/word/2010/wordprocessingGroup" xmlns:wpi="http://schemas.microsoft.com/office/word/2010/wordprocessingInk" xmlns:wne="http://schemas.microsoft.com/office/word/2006/wordml" xmlns:wps="http://schemas.microsoft.com/office/word/2010/wordprocessingShape" mc:Ignorable="w14 w15 w16se w16cid w16 w16cex w16sdtdh wp14">
   <w:sdt>
     <w:sdtPr>
       <w:id w:val="-937982979"/>
@@ -2247,7 +2450,6 @@
         <w:docPartUnique/>
       </w:docPartObj>
     </w:sdtPr>
-    <w:sdtEndPr/>
     <w:sdtContent>
       <w:p>
         <w:pPr>
@@ -2459,7 +2661,7 @@
             </mc:Choice>
             <mc:Fallback>
               <w:pict>
-                <v:group w14:anchorId="51D00065" id="Grupo 32" o:spid="_x0000_s1026" style="position:absolute;margin-left:0;margin-top:0;width:610.5pt;height:15pt;z-index:251659264;mso-width-percent:1000;mso-position-horizontal:center;mso-position-horizontal-relative:page;mso-position-vertical:center;mso-position-vertical-relative:bottom-margin-area;mso-width-percent:1000" coordorigin=",14970" coordsize="12255,300" o:gfxdata="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">
+                <v:group w14:anchorId="51D00065" id="Grupo 32" o:spid="_x0000_s1026" style="position:absolute;margin-left:0;margin-top:0;width:610.5pt;height:15pt;z-index:251659264;mso-width-percent:1000;mso-position-horizontal:center;mso-position-horizontal-relative:page;mso-position-vertical:center;mso-position-vertical-relative:bottom-margin-area;mso-width-percent:1000" coordorigin=",14970" coordsize="12255,300" o:gfxdata="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">
                   <v:shapetype id="_x0000_t202" coordsize="21600,21600" o:spt="202" path="m,l,21600r21600,l21600,xe">
                     <v:stroke joinstyle="miter"/>
                     <v:path gradientshapeok="t" o:connecttype="rect"/>
@@ -2526,7 +2728,7 @@
 </file>
 
 <file path=word/footnotes.xml><?xml version="1.0" encoding="utf-8"?>
-<w:footnotes xmlns:wpc="http://schemas.microsoft.com/office/word/2010/wordprocessingCanvas" xmlns:cx="http://schemas.microsoft.com/office/drawing/2014/chartex" xmlns:mc="http://schemas.openxmlformats.org/markup-compatibility/2006" xmlns:o="urn:schemas-microsoft-com:office:office" xmlns:r="http://schemas.openxmlformats.org/officeDocument/2006/relationships" xmlns:m="http://schemas.openxmlformats.org/officeDocument/2006/math" xmlns:v="urn:schemas-microsoft-com:vml" xmlns:wp14="http://schemas.microsoft.com/office/word/2010/wordprocessingDrawing" xmlns:wp="http://schemas.openxmlformats.org/drawingml/2006/wordprocessingDrawing" xmlns:w10="urn:schemas-microsoft-com:office:word" xmlns:w="http://schemas.openxmlformats.org/wordprocessingml/2006/main" xmlns:w14="http://schemas.microsoft.com/office/word/2010/wordml" xmlns:w15="http://schemas.microsoft.com/office/word/2012/wordml" xmlns:w16se="http://schemas.microsoft.com/office/word/2015/wordml/symex" xmlns:wpg="http://schemas.microsoft.com/office/word/2010/wordprocessingGroup" xmlns:wpi="http://schemas.microsoft.com/office/word/2010/wordprocessingInk" xmlns:wne="http://schemas.microsoft.com/office/word/2006/wordml" xmlns:wps="http://schemas.microsoft.com/office/word/2010/wordprocessingShape" mc:Ignorable="w14 w15 w16se wp14">
+<w:footnotes xmlns:wpc="http://schemas.microsoft.com/office/word/2010/wordprocessingCanvas" xmlns:cx="http://schemas.microsoft.com/office/drawing/2014/chartex" xmlns:cx1="http://schemas.microsoft.com/office/drawing/2015/9/8/chartex" xmlns:cx2="http://schemas.microsoft.com/office/drawing/2015/10/21/chartex" xmlns:cx3="http://schemas.microsoft.com/office/drawing/2016/5/9/chartex" xmlns:cx4="http://schemas.microsoft.com/office/drawing/2016/5/10/chartex" xmlns:cx5="http://schemas.microsoft.com/office/drawing/2016/5/11/chartex" xmlns:cx6="http://schemas.microsoft.com/office/drawing/2016/5/12/chartex" xmlns:cx7="http://schemas.microsoft.com/office/drawing/2016/5/13/chartex" xmlns:cx8="http://schemas.microsoft.com/office/drawing/2016/5/14/chartex" xmlns:mc="http://schemas.openxmlformats.org/markup-compatibility/2006" xmlns:aink="http://schemas.microsoft.com/office/drawing/2016/ink" xmlns:am3d="http://schemas.microsoft.com/office/drawing/2017/model3d" xmlns:o="urn:schemas-microsoft-com:office:office" xmlns:oel="http://schemas.microsoft.com/office/2019/extlst" xmlns:r="http://schemas.openxmlformats.org/officeDocument/2006/relationships" xmlns:m="http://schemas.openxmlformats.org/officeDocument/2006/math" xmlns:v="urn:schemas-microsoft-com:vml" xmlns:wp14="http://schemas.microsoft.com/office/word/2010/wordprocessingDrawing" xmlns:wp="http://schemas.openxmlformats.org/drawingml/2006/wordprocessingDrawing" xmlns:w10="urn:schemas-microsoft-com:office:word" xmlns:w="http://schemas.openxmlformats.org/wordprocessingml/2006/main" xmlns:w14="http://schemas.microsoft.com/office/word/2010/wordml" xmlns:w15="http://schemas.microsoft.com/office/word/2012/wordml" xmlns:w16cex="http://schemas.microsoft.com/office/word/2018/wordml/cex" xmlns:w16cid="http://schemas.microsoft.com/office/word/2016/wordml/cid" xmlns:w16="http://schemas.microsoft.com/office/word/2018/wordml" xmlns:w16sdtdh="http://schemas.microsoft.com/office/word/2020/wordml/sdtdatahash" xmlns:w16se="http://schemas.microsoft.com/office/word/2015/wordml/symex" xmlns:wpg="http://schemas.microsoft.com/office/word/2010/wordprocessingGroup" xmlns:wpi="http://schemas.microsoft.com/office/word/2010/wordprocessingInk" xmlns:wne="http://schemas.microsoft.com/office/word/2006/wordml" xmlns:wps="http://schemas.microsoft.com/office/word/2010/wordprocessingShape" mc:Ignorable="w14 w15 w16se w16cid w16 w16cex w16sdtdh wp14">
   <w:footnote w:type="separator" w:id="-1">
     <w:p>
       <w:pPr>
@@ -2551,7 +2753,7 @@
 </file>
 
 <file path=word/header1.xml><?xml version="1.0" encoding="utf-8"?>
-<w:hdr xmlns:wpc="http://schemas.microsoft.com/office/word/2010/wordprocessingCanvas" xmlns:cx="http://schemas.microsoft.com/office/drawing/2014/chartex" xmlns:mc="http://schemas.openxmlformats.org/markup-compatibility/2006" xmlns:o="urn:schemas-microsoft-com:office:office" xmlns:r="http://schemas.openxmlformats.org/officeDocument/2006/relationships" xmlns:m="http://schemas.openxmlformats.org/officeDocument/2006/math" xmlns:v="urn:schemas-microsoft-com:vml" xmlns:wp14="http://schemas.microsoft.com/office/word/2010/wordprocessingDrawing" xmlns:wp="http://schemas.openxmlformats.org/drawingml/2006/wordprocessingDrawing" xmlns:w10="urn:schemas-microsoft-com:office:word" xmlns:w="http://schemas.openxmlformats.org/wordprocessingml/2006/main" xmlns:w14="http://schemas.microsoft.com/office/word/2010/wordml" xmlns:w15="http://schemas.microsoft.com/office/word/2012/wordml" xmlns:w16se="http://schemas.microsoft.com/office/word/2015/wordml/symex" xmlns:wpg="http://schemas.microsoft.com/office/word/2010/wordprocessingGroup" xmlns:wpi="http://schemas.microsoft.com/office/word/2010/wordprocessingInk" xmlns:wne="http://schemas.microsoft.com/office/word/2006/wordml" xmlns:wps="http://schemas.microsoft.com/office/word/2010/wordprocessingShape" mc:Ignorable="w14 w15 w16se wp14">
+<w:hdr xmlns:wpc="http://schemas.microsoft.com/office/word/2010/wordprocessingCanvas" xmlns:cx="http://schemas.microsoft.com/office/drawing/2014/chartex" xmlns:cx1="http://schemas.microsoft.com/office/drawing/2015/9/8/chartex" xmlns:cx2="http://schemas.microsoft.com/office/drawing/2015/10/21/chartex" xmlns:cx3="http://schemas.microsoft.com/office/drawing/2016/5/9/chartex" xmlns:cx4="http://schemas.microsoft.com/office/drawing/2016/5/10/chartex" xmlns:cx5="http://schemas.microsoft.com/office/drawing/2016/5/11/chartex" xmlns:cx6="http://schemas.microsoft.com/office/drawing/2016/5/12/chartex" xmlns:cx7="http://schemas.microsoft.com/office/drawing/2016/5/13/chartex" xmlns:cx8="http://schemas.microsoft.com/office/drawing/2016/5/14/chartex" xmlns:mc="http://schemas.openxmlformats.org/markup-compatibility/2006" xmlns:aink="http://schemas.microsoft.com/office/drawing/2016/ink" xmlns:am3d="http://schemas.microsoft.com/office/drawing/2017/model3d" xmlns:o="urn:schemas-microsoft-com:office:office" xmlns:oel="http://schemas.microsoft.com/office/2019/extlst" xmlns:r="http://schemas.openxmlformats.org/officeDocument/2006/relationships" xmlns:m="http://schemas.openxmlformats.org/officeDocument/2006/math" xmlns:v="urn:schemas-microsoft-com:vml" xmlns:wp14="http://schemas.microsoft.com/office/word/2010/wordprocessingDrawing" xmlns:wp="http://schemas.openxmlformats.org/drawingml/2006/wordprocessingDrawing" xmlns:w10="urn:schemas-microsoft-com:office:word" xmlns:w="http://schemas.openxmlformats.org/wordprocessingml/2006/main" xmlns:w14="http://schemas.microsoft.com/office/word/2010/wordml" xmlns:w15="http://schemas.microsoft.com/office/word/2012/wordml" xmlns:w16cex="http://schemas.microsoft.com/office/word/2018/wordml/cex" xmlns:w16cid="http://schemas.microsoft.com/office/word/2016/wordml/cid" xmlns:w16="http://schemas.microsoft.com/office/word/2018/wordml" xmlns:w16sdtdh="http://schemas.microsoft.com/office/word/2020/wordml/sdtdatahash" xmlns:w16se="http://schemas.microsoft.com/office/word/2015/wordml/symex" xmlns:wpg="http://schemas.microsoft.com/office/word/2010/wordprocessingGroup" xmlns:wpi="http://schemas.microsoft.com/office/word/2010/wordprocessingInk" xmlns:wne="http://schemas.microsoft.com/office/word/2006/wordml" xmlns:wps="http://schemas.microsoft.com/office/word/2010/wordprocessingShape" mc:Ignorable="w14 w15 w16se w16cid w16 w16cex w16sdtdh wp14">
   <w:tbl>
     <w:tblPr>
       <w:tblStyle w:val="Tablaconcuadrcula"/>
@@ -2721,7 +2923,7 @@
 </file>
 
 <file path=word/header2.xml><?xml version="1.0" encoding="utf-8"?>
-<w:hdr xmlns:wpc="http://schemas.microsoft.com/office/word/2010/wordprocessingCanvas" xmlns:cx="http://schemas.microsoft.com/office/drawing/2014/chartex" xmlns:mc="http://schemas.openxmlformats.org/markup-compatibility/2006" xmlns:o="urn:schemas-microsoft-com:office:office" xmlns:r="http://schemas.openxmlformats.org/officeDocument/2006/relationships" xmlns:m="http://schemas.openxmlformats.org/officeDocument/2006/math" xmlns:v="urn:schemas-microsoft-com:vml" xmlns:wp14="http://schemas.microsoft.com/office/word/2010/wordprocessingDrawing" xmlns:wp="http://schemas.openxmlformats.org/drawingml/2006/wordprocessingDrawing" xmlns:w10="urn:schemas-microsoft-com:office:word" xmlns:w="http://schemas.openxmlformats.org/wordprocessingml/2006/main" xmlns:w14="http://schemas.microsoft.com/office/word/2010/wordml" xmlns:w15="http://schemas.microsoft.com/office/word/2012/wordml" xmlns:w16se="http://schemas.microsoft.com/office/word/2015/wordml/symex" xmlns:wpg="http://schemas.microsoft.com/office/word/2010/wordprocessingGroup" xmlns:wpi="http://schemas.microsoft.com/office/word/2010/wordprocessingInk" xmlns:wne="http://schemas.microsoft.com/office/word/2006/wordml" xmlns:wps="http://schemas.microsoft.com/office/word/2010/wordprocessingShape" mc:Ignorable="w14 w15 w16se wp14">
+<w:hdr xmlns:wpc="http://schemas.microsoft.com/office/word/2010/wordprocessingCanvas" xmlns:cx="http://schemas.microsoft.com/office/drawing/2014/chartex" xmlns:cx1="http://schemas.microsoft.com/office/drawing/2015/9/8/chartex" xmlns:cx2="http://schemas.microsoft.com/office/drawing/2015/10/21/chartex" xmlns:cx3="http://schemas.microsoft.com/office/drawing/2016/5/9/chartex" xmlns:cx4="http://schemas.microsoft.com/office/drawing/2016/5/10/chartex" xmlns:cx5="http://schemas.microsoft.com/office/drawing/2016/5/11/chartex" xmlns:cx6="http://schemas.microsoft.com/office/drawing/2016/5/12/chartex" xmlns:cx7="http://schemas.microsoft.com/office/drawing/2016/5/13/chartex" xmlns:cx8="http://schemas.microsoft.com/office/drawing/2016/5/14/chartex" xmlns:mc="http://schemas.openxmlformats.org/markup-compatibility/2006" xmlns:aink="http://schemas.microsoft.com/office/drawing/2016/ink" xmlns:am3d="http://schemas.microsoft.com/office/drawing/2017/model3d" xmlns:o="urn:schemas-microsoft-com:office:office" xmlns:oel="http://schemas.microsoft.com/office/2019/extlst" xmlns:r="http://schemas.openxmlformats.org/officeDocument/2006/relationships" xmlns:m="http://schemas.openxmlformats.org/officeDocument/2006/math" xmlns:v="urn:schemas-microsoft-com:vml" xmlns:wp14="http://schemas.microsoft.com/office/word/2010/wordprocessingDrawing" xmlns:wp="http://schemas.openxmlformats.org/drawingml/2006/wordprocessingDrawing" xmlns:w10="urn:schemas-microsoft-com:office:word" xmlns:w="http://schemas.openxmlformats.org/wordprocessingml/2006/main" xmlns:w14="http://schemas.microsoft.com/office/word/2010/wordml" xmlns:w15="http://schemas.microsoft.com/office/word/2012/wordml" xmlns:w16cex="http://schemas.microsoft.com/office/word/2018/wordml/cex" xmlns:w16cid="http://schemas.microsoft.com/office/word/2016/wordml/cid" xmlns:w16="http://schemas.microsoft.com/office/word/2018/wordml" xmlns:w16sdtdh="http://schemas.microsoft.com/office/word/2020/wordml/sdtdatahash" xmlns:w16se="http://schemas.microsoft.com/office/word/2015/wordml/symex" xmlns:wpg="http://schemas.microsoft.com/office/word/2010/wordprocessingGroup" xmlns:wpi="http://schemas.microsoft.com/office/word/2010/wordprocessingInk" xmlns:wne="http://schemas.microsoft.com/office/word/2006/wordml" xmlns:wps="http://schemas.microsoft.com/office/word/2010/wordprocessingShape" mc:Ignorable="w14 w15 w16se w16cid w16 w16cex w16sdtdh wp14">
   <w:tbl>
     <w:tblPr>
       <w:tblStyle w:val="Tablaconcuadrcula"/>
@@ -2994,7 +3196,7 @@
 </file>
 
 <file path=word/numbering.xml><?xml version="1.0" encoding="utf-8"?>
-<w:numbering xmlns:wpc="http://schemas.microsoft.com/office/word/2010/wordprocessingCanvas" xmlns:cx="http://schemas.microsoft.com/office/drawing/2014/chartex" xmlns:mc="http://schemas.openxmlformats.org/markup-compatibility/2006" xmlns:o="urn:schemas-microsoft-com:office:office" xmlns:r="http://schemas.openxmlformats.org/officeDocument/2006/relationships" xmlns:m="http://schemas.openxmlformats.org/officeDocument/2006/math" xmlns:v="urn:schemas-microsoft-com:vml" xmlns:wp14="http://schemas.microsoft.com/office/word/2010/wordprocessingDrawing" xmlns:wp="http://schemas.openxmlformats.org/drawingml/2006/wordprocessingDrawing" xmlns:w10="urn:schemas-microsoft-com:office:word" xmlns:w="http://schemas.openxmlformats.org/wordprocessingml/2006/main" xmlns:w14="http://schemas.microsoft.com/office/word/2010/wordml" xmlns:w15="http://schemas.microsoft.com/office/word/2012/wordml" xmlns:w16se="http://schemas.microsoft.com/office/word/2015/wordml/symex" xmlns:wpg="http://schemas.microsoft.com/office/word/2010/wordprocessingGroup" xmlns:wpi="http://schemas.microsoft.com/office/word/2010/wordprocessingInk" xmlns:wne="http://schemas.microsoft.com/office/word/2006/wordml" xmlns:wps="http://schemas.microsoft.com/office/word/2010/wordprocessingShape" mc:Ignorable="w14 w15 w16se wp14">
+<w:numbering xmlns:wpc="http://schemas.microsoft.com/office/word/2010/wordprocessingCanvas" xmlns:cx="http://schemas.microsoft.com/office/drawing/2014/chartex" xmlns:cx1="http://schemas.microsoft.com/office/drawing/2015/9/8/chartex" xmlns:cx2="http://schemas.microsoft.com/office/drawing/2015/10/21/chartex" xmlns:cx3="http://schemas.microsoft.com/office/drawing/2016/5/9/chartex" xmlns:cx4="http://schemas.microsoft.com/office/drawing/2016/5/10/chartex" xmlns:cx5="http://schemas.microsoft.com/office/drawing/2016/5/11/chartex" xmlns:cx6="http://schemas.microsoft.com/office/drawing/2016/5/12/chartex" xmlns:cx7="http://schemas.microsoft.com/office/drawing/2016/5/13/chartex" xmlns:cx8="http://schemas.microsoft.com/office/drawing/2016/5/14/chartex" xmlns:mc="http://schemas.openxmlformats.org/markup-compatibility/2006" xmlns:aink="http://schemas.microsoft.com/office/drawing/2016/ink" xmlns:am3d="http://schemas.microsoft.com/office/drawing/2017/model3d" xmlns:o="urn:schemas-microsoft-com:office:office" xmlns:oel="http://schemas.microsoft.com/office/2019/extlst" xmlns:r="http://schemas.openxmlformats.org/officeDocument/2006/relationships" xmlns:m="http://schemas.openxmlformats.org/officeDocument/2006/math" xmlns:v="urn:schemas-microsoft-com:vml" xmlns:wp14="http://schemas.microsoft.com/office/word/2010/wordprocessingDrawing" xmlns:wp="http://schemas.openxmlformats.org/drawingml/2006/wordprocessingDrawing" xmlns:w10="urn:schemas-microsoft-com:office:word" xmlns:w="http://schemas.openxmlformats.org/wordprocessingml/2006/main" xmlns:w14="http://schemas.microsoft.com/office/word/2010/wordml" xmlns:w15="http://schemas.microsoft.com/office/word/2012/wordml" xmlns:w16cex="http://schemas.microsoft.com/office/word/2018/wordml/cex" xmlns:w16cid="http://schemas.microsoft.com/office/word/2016/wordml/cid" xmlns:w16="http://schemas.microsoft.com/office/word/2018/wordml" xmlns:w16sdtdh="http://schemas.microsoft.com/office/word/2020/wordml/sdtdatahash" xmlns:w16se="http://schemas.microsoft.com/office/word/2015/wordml/symex" xmlns:wpg="http://schemas.microsoft.com/office/word/2010/wordprocessingGroup" xmlns:wpi="http://schemas.microsoft.com/office/word/2010/wordprocessingInk" xmlns:wne="http://schemas.microsoft.com/office/word/2006/wordml" xmlns:wps="http://schemas.microsoft.com/office/word/2010/wordprocessingShape" mc:Ignorable="w14 w15 w16se w16cid w16 w16cex w16sdtdh wp14">
   <w:abstractNum w:abstractNumId="0" w15:restartNumberingAfterBreak="0">
     <w:nsid w:val="049156A1"/>
     <w:multiLevelType w:val="hybridMultilevel"/>
@@ -7568,124 +7770,124 @@
       </w:rPr>
     </w:lvl>
   </w:abstractNum>
-  <w:num w:numId="1">
+  <w:num w:numId="1" w16cid:durableId="1060053047">
     <w:abstractNumId w:val="3"/>
   </w:num>
-  <w:num w:numId="2">
+  <w:num w:numId="2" w16cid:durableId="1911574680">
     <w:abstractNumId w:val="8"/>
   </w:num>
-  <w:num w:numId="3">
+  <w:num w:numId="3" w16cid:durableId="728194099">
     <w:abstractNumId w:val="12"/>
   </w:num>
-  <w:num w:numId="4">
+  <w:num w:numId="4" w16cid:durableId="997879370">
     <w:abstractNumId w:val="28"/>
   </w:num>
-  <w:num w:numId="5">
+  <w:num w:numId="5" w16cid:durableId="1783114293">
     <w:abstractNumId w:val="30"/>
   </w:num>
-  <w:num w:numId="6">
+  <w:num w:numId="6" w16cid:durableId="82075766">
     <w:abstractNumId w:val="4"/>
   </w:num>
-  <w:num w:numId="7">
+  <w:num w:numId="7" w16cid:durableId="1183008032">
     <w:abstractNumId w:val="11"/>
   </w:num>
-  <w:num w:numId="8">
+  <w:num w:numId="8" w16cid:durableId="1695761383">
     <w:abstractNumId w:val="19"/>
   </w:num>
-  <w:num w:numId="9">
+  <w:num w:numId="9" w16cid:durableId="2049716495">
     <w:abstractNumId w:val="15"/>
   </w:num>
-  <w:num w:numId="10">
+  <w:num w:numId="10" w16cid:durableId="472715976">
     <w:abstractNumId w:val="9"/>
   </w:num>
-  <w:num w:numId="11">
+  <w:num w:numId="11" w16cid:durableId="949816462">
     <w:abstractNumId w:val="24"/>
   </w:num>
-  <w:num w:numId="12">
+  <w:num w:numId="12" w16cid:durableId="210388568">
     <w:abstractNumId w:val="35"/>
   </w:num>
-  <w:num w:numId="13">
+  <w:num w:numId="13" w16cid:durableId="2040084523">
     <w:abstractNumId w:val="29"/>
   </w:num>
-  <w:num w:numId="14">
+  <w:num w:numId="14" w16cid:durableId="1399015468">
     <w:abstractNumId w:val="1"/>
   </w:num>
-  <w:num w:numId="15">
+  <w:num w:numId="15" w16cid:durableId="1559587344">
     <w:abstractNumId w:val="36"/>
   </w:num>
-  <w:num w:numId="16">
+  <w:num w:numId="16" w16cid:durableId="240137617">
     <w:abstractNumId w:val="21"/>
   </w:num>
-  <w:num w:numId="17">
+  <w:num w:numId="17" w16cid:durableId="701126984">
     <w:abstractNumId w:val="17"/>
   </w:num>
-  <w:num w:numId="18">
+  <w:num w:numId="18" w16cid:durableId="985663706">
     <w:abstractNumId w:val="31"/>
   </w:num>
-  <w:num w:numId="19">
+  <w:num w:numId="19" w16cid:durableId="290288733">
     <w:abstractNumId w:val="10"/>
   </w:num>
-  <w:num w:numId="20">
+  <w:num w:numId="20" w16cid:durableId="967466773">
     <w:abstractNumId w:val="39"/>
   </w:num>
-  <w:num w:numId="21">
+  <w:num w:numId="21" w16cid:durableId="27224620">
     <w:abstractNumId w:val="34"/>
   </w:num>
-  <w:num w:numId="22">
+  <w:num w:numId="22" w16cid:durableId="1847749598">
     <w:abstractNumId w:val="13"/>
   </w:num>
-  <w:num w:numId="23">
+  <w:num w:numId="23" w16cid:durableId="1408068156">
     <w:abstractNumId w:val="14"/>
   </w:num>
-  <w:num w:numId="24">
+  <w:num w:numId="24" w16cid:durableId="137578178">
     <w:abstractNumId w:val="5"/>
   </w:num>
-  <w:num w:numId="25">
+  <w:num w:numId="25" w16cid:durableId="1773236019">
     <w:abstractNumId w:val="16"/>
   </w:num>
-  <w:num w:numId="26">
+  <w:num w:numId="26" w16cid:durableId="2032412451">
     <w:abstractNumId w:val="20"/>
   </w:num>
-  <w:num w:numId="27">
+  <w:num w:numId="27" w16cid:durableId="1215239205">
     <w:abstractNumId w:val="23"/>
   </w:num>
-  <w:num w:numId="28">
+  <w:num w:numId="28" w16cid:durableId="1564214114">
     <w:abstractNumId w:val="0"/>
   </w:num>
-  <w:num w:numId="29">
+  <w:num w:numId="29" w16cid:durableId="1786773551">
     <w:abstractNumId w:val="18"/>
   </w:num>
-  <w:num w:numId="30">
+  <w:num w:numId="30" w16cid:durableId="1625383173">
     <w:abstractNumId w:val="22"/>
   </w:num>
-  <w:num w:numId="31">
+  <w:num w:numId="31" w16cid:durableId="364448904">
     <w:abstractNumId w:val="2"/>
   </w:num>
-  <w:num w:numId="32">
+  <w:num w:numId="32" w16cid:durableId="599069908">
     <w:abstractNumId w:val="7"/>
   </w:num>
-  <w:num w:numId="33">
+  <w:num w:numId="33" w16cid:durableId="94402526">
     <w:abstractNumId w:val="32"/>
   </w:num>
-  <w:num w:numId="34">
+  <w:num w:numId="34" w16cid:durableId="314340317">
     <w:abstractNumId w:val="38"/>
   </w:num>
-  <w:num w:numId="35">
+  <w:num w:numId="35" w16cid:durableId="2094737050">
     <w:abstractNumId w:val="6"/>
   </w:num>
-  <w:num w:numId="36">
+  <w:num w:numId="36" w16cid:durableId="1897157747">
     <w:abstractNumId w:val="25"/>
   </w:num>
-  <w:num w:numId="37">
+  <w:num w:numId="37" w16cid:durableId="1244298064">
     <w:abstractNumId w:val="37"/>
   </w:num>
-  <w:num w:numId="38">
+  <w:num w:numId="38" w16cid:durableId="887647914">
     <w:abstractNumId w:val="27"/>
   </w:num>
-  <w:num w:numId="39">
+  <w:num w:numId="39" w16cid:durableId="174809832">
     <w:abstractNumId w:val="26"/>
   </w:num>
-  <w:num w:numId="40">
+  <w:num w:numId="40" w16cid:durableId="451754488">
     <w:abstractNumId w:val="33"/>
   </w:num>
   <w:numIdMacAtCleanup w:val="18"/>
@@ -7693,7 +7895,7 @@
 </file>
 
 <file path=word/styles.xml><?xml version="1.0" encoding="utf-8"?>
-<w:styles xmlns:mc="http://schemas.openxmlformats.org/markup-compatibility/2006" xmlns:r="http://schemas.openxmlformats.org/officeDocument/2006/relationships" xmlns:w="http://schemas.openxmlformats.org/wordprocessingml/2006/main" xmlns:w14="http://schemas.microsoft.com/office/word/2010/wordml" xmlns:w15="http://schemas.microsoft.com/office/word/2012/wordml" xmlns:w16se="http://schemas.microsoft.com/office/word/2015/wordml/symex" mc:Ignorable="w14 w15 w16se">
+<w:styles xmlns:mc="http://schemas.openxmlformats.org/markup-compatibility/2006" xmlns:r="http://schemas.openxmlformats.org/officeDocument/2006/relationships" xmlns:w="http://schemas.openxmlformats.org/wordprocessingml/2006/main" xmlns:w14="http://schemas.microsoft.com/office/word/2010/wordml" xmlns:w15="http://schemas.microsoft.com/office/word/2012/wordml" xmlns:w16cex="http://schemas.microsoft.com/office/word/2018/wordml/cex" xmlns:w16cid="http://schemas.microsoft.com/office/word/2016/wordml/cid" xmlns:w16="http://schemas.microsoft.com/office/word/2018/wordml" xmlns:w16sdtdh="http://schemas.microsoft.com/office/word/2020/wordml/sdtdatahash" xmlns:w16se="http://schemas.microsoft.com/office/word/2015/wordml/symex" mc:Ignorable="w14 w15 w16se w16cid w16 w16cex w16sdtdh">
   <w:docDefaults>
     <w:rPrDefault>
       <w:rPr>
@@ -7709,7 +7911,7 @@
       </w:pPr>
     </w:pPrDefault>
   </w:docDefaults>
-  <w:latentStyles w:defLockedState="0" w:defUIPriority="99" w:defSemiHidden="0" w:defUnhideWhenUsed="0" w:defQFormat="0" w:count="371">
+  <w:latentStyles w:defLockedState="0" w:defUIPriority="99" w:defSemiHidden="0" w:defUnhideWhenUsed="0" w:defQFormat="0" w:count="376">
     <w:lsdException w:name="Normal" w:uiPriority="0" w:qFormat="1"/>
     <w:lsdException w:name="heading 1" w:uiPriority="9" w:qFormat="1"/>
     <w:lsdException w:name="heading 2" w:semiHidden="1" w:uiPriority="9" w:unhideWhenUsed="1" w:qFormat="1"/>
@@ -8081,6 +8283,11 @@
     <w:lsdException w:name="List Table 5 Dark Accent 6" w:uiPriority="50"/>
     <w:lsdException w:name="List Table 6 Colorful Accent 6" w:uiPriority="51"/>
     <w:lsdException w:name="List Table 7 Colorful Accent 6" w:uiPriority="52"/>
+    <w:lsdException w:name="Mention" w:semiHidden="1" w:unhideWhenUsed="1"/>
+    <w:lsdException w:name="Smart Hyperlink" w:semiHidden="1" w:unhideWhenUsed="1"/>
+    <w:lsdException w:name="Hashtag" w:semiHidden="1" w:unhideWhenUsed="1"/>
+    <w:lsdException w:name="Unresolved Mention" w:semiHidden="1" w:unhideWhenUsed="1"/>
+    <w:lsdException w:name="Smart Link" w:semiHidden="1" w:unhideWhenUsed="1"/>
   </w:latentStyles>
   <w:style w:type="paragraph" w:default="1" w:styleId="Normal">
     <w:name w:val="Normal"/>
@@ -8154,7 +8361,6 @@
   <w:style w:type="character" w:default="1" w:styleId="Fuentedeprrafopredeter">
     <w:name w:val="Default Paragraph Font"/>
     <w:uiPriority w:val="1"/>
-    <w:semiHidden/>
     <w:unhideWhenUsed/>
   </w:style>
   <w:style w:type="table" w:default="1" w:styleId="Tablanormal">
@@ -9064,7 +9270,7 @@
       <w:szCs w:val="24"/>
     </w:rPr>
   </w:style>
-  <w:style w:type="table" w:styleId="Cuadrculadetablaclara">
+  <w:style w:type="table" w:styleId="Tablaconcuadrculaclara">
     <w:name w:val="Grid Table Light"/>
     <w:basedOn w:val="Tablanormal"/>
     <w:uiPriority w:val="40"/>
@@ -9086,7 +9292,7 @@
   <w:style w:type="table" w:customStyle="1" w:styleId="Cuadrculadetablaclara1">
     <w:name w:val="Cuadrícula de tabla clara1"/>
     <w:basedOn w:val="Tablanormal"/>
-    <w:next w:val="Cuadrculadetablaclara"/>
+    <w:next w:val="Tablaconcuadrculaclara"/>
     <w:uiPriority w:val="40"/>
     <w:rsid w:val="00943DF1"/>
     <w:pPr>
@@ -9139,532 +9345,6 @@
     </w:rPr>
   </w:style>
 </w:styles>
-</file>
-
-<file path=word/glossary/document.xml><?xml version="1.0" encoding="utf-8"?>
-<w:glossaryDocument xmlns:wpc="http://schemas.microsoft.com/office/word/2010/wordprocessingCanvas" xmlns:cx="http://schemas.microsoft.com/office/drawing/2014/chartex" xmlns:mc="http://schemas.openxmlformats.org/markup-compatibility/2006" xmlns:o="urn:schemas-microsoft-com:office:office" xmlns:r="http://schemas.openxmlformats.org/officeDocument/2006/relationships" xmlns:m="http://schemas.openxmlformats.org/officeDocument/2006/math" xmlns:v="urn:schemas-microsoft-com:vml" xmlns:wp14="http://schemas.microsoft.com/office/word/2010/wordprocessingDrawing" xmlns:wp="http://schemas.openxmlformats.org/drawingml/2006/wordprocessingDrawing" xmlns:w10="urn:schemas-microsoft-com:office:word" xmlns:w="http://schemas.openxmlformats.org/wordprocessingml/2006/main" xmlns:w14="http://schemas.microsoft.com/office/word/2010/wordml" xmlns:w15="http://schemas.microsoft.com/office/word/2012/wordml" xmlns:w16se="http://schemas.microsoft.com/office/word/2015/wordml/symex" xmlns:wpg="http://schemas.microsoft.com/office/word/2010/wordprocessingGroup" xmlns:wpi="http://schemas.microsoft.com/office/word/2010/wordprocessingInk" xmlns:wne="http://schemas.microsoft.com/office/word/2006/wordml" xmlns:wps="http://schemas.microsoft.com/office/word/2010/wordprocessingShape" mc:Ignorable="w14 w15 w16se wp14"/>
-</file>
-
-<file path=word/glossary/fontTable.xml><?xml version="1.0" encoding="utf-8"?>
-<w:fonts xmlns:mc="http://schemas.openxmlformats.org/markup-compatibility/2006" xmlns:r="http://schemas.openxmlformats.org/officeDocument/2006/relationships" xmlns:w="http://schemas.openxmlformats.org/wordprocessingml/2006/main" xmlns:w14="http://schemas.microsoft.com/office/word/2010/wordml" xmlns:w15="http://schemas.microsoft.com/office/word/2012/wordml" xmlns:w16se="http://schemas.microsoft.com/office/word/2015/wordml/symex" mc:Ignorable="w14 w15 w16se">
-  <w:font w:name="Calibri">
-    <w:panose1 w:val="020F0502020204030204"/>
-    <w:charset w:val="00"/>
-    <w:family w:val="swiss"/>
-    <w:pitch w:val="variable"/>
-    <w:sig w:usb0="E4002EFF" w:usb1="C000247B" w:usb2="00000009" w:usb3="00000000" w:csb0="000001FF" w:csb1="00000000"/>
-  </w:font>
-  <w:font w:name="Times New Roman">
-    <w:panose1 w:val="02020603050405020304"/>
-    <w:charset w:val="00"/>
-    <w:family w:val="roman"/>
-    <w:pitch w:val="variable"/>
-    <w:sig w:usb0="E0002EFF" w:usb1="C000785B" w:usb2="00000009" w:usb3="00000000" w:csb0="000001FF" w:csb1="00000000"/>
-  </w:font>
-  <w:font w:name="Courier New">
-    <w:panose1 w:val="02070309020205020404"/>
-    <w:charset w:val="00"/>
-    <w:family w:val="modern"/>
-    <w:pitch w:val="fixed"/>
-    <w:sig w:usb0="E0002EFF" w:usb1="C0007843" w:usb2="00000009" w:usb3="00000000" w:csb0="000001FF" w:csb1="00000000"/>
-  </w:font>
-  <w:font w:name="Wingdings">
-    <w:panose1 w:val="05000000000000000000"/>
-    <w:charset w:val="02"/>
-    <w:family w:val="auto"/>
-    <w:pitch w:val="variable"/>
-    <w:sig w:usb0="00000000" w:usb1="10000000" w:usb2="00000000" w:usb3="00000000" w:csb0="80000000" w:csb1="00000000"/>
-  </w:font>
-  <w:font w:name="Symbol">
-    <w:panose1 w:val="05050102010706020507"/>
-    <w:charset w:val="02"/>
-    <w:family w:val="roman"/>
-    <w:pitch w:val="variable"/>
-    <w:sig w:usb0="00000000" w:usb1="10000000" w:usb2="00000000" w:usb3="00000000" w:csb0="80000000" w:csb1="00000000"/>
-  </w:font>
-  <w:font w:name="Calibri Light">
-    <w:panose1 w:val="020F0302020204030204"/>
-    <w:charset w:val="00"/>
-    <w:family w:val="swiss"/>
-    <w:pitch w:val="variable"/>
-    <w:sig w:usb0="E4002EFF" w:usb1="C000247B" w:usb2="00000009" w:usb3="00000000" w:csb0="000001FF" w:csb1="00000000"/>
-  </w:font>
-  <w:font w:name="Segoe UI">
-    <w:panose1 w:val="020B0502040204020203"/>
-    <w:charset w:val="00"/>
-    <w:family w:val="swiss"/>
-    <w:pitch w:val="variable"/>
-    <w:sig w:usb0="E4002EFF" w:usb1="C000E47F" w:usb2="00000009" w:usb3="00000000" w:csb0="000001FF" w:csb1="00000000"/>
-  </w:font>
-  <w:font w:name="Century Gothic">
-    <w:panose1 w:val="020B0502020202020204"/>
-    <w:charset w:val="00"/>
-    <w:family w:val="swiss"/>
-    <w:pitch w:val="variable"/>
-    <w:sig w:usb0="00000287" w:usb1="00000000" w:usb2="00000000" w:usb3="00000000" w:csb0="0000009F" w:csb1="00000000"/>
-  </w:font>
-</w:fonts>
-</file>
-
-<file path=word/glossary/settings.xml><?xml version="1.0" encoding="utf-8"?>
-<w:settings xmlns:mc="http://schemas.openxmlformats.org/markup-compatibility/2006" xmlns:o="urn:schemas-microsoft-com:office:office" xmlns:r="http://schemas.openxmlformats.org/officeDocument/2006/relationships" xmlns:m="http://schemas.openxmlformats.org/officeDocument/2006/math" xmlns:v="urn:schemas-microsoft-com:vml" xmlns:w10="urn:schemas-microsoft-com:office:word" xmlns:w="http://schemas.openxmlformats.org/wordprocessingml/2006/main" xmlns:w14="http://schemas.microsoft.com/office/word/2010/wordml" xmlns:w15="http://schemas.microsoft.com/office/word/2012/wordml" xmlns:w16se="http://schemas.microsoft.com/office/word/2015/wordml/symex" xmlns:sl="http://schemas.openxmlformats.org/schemaLibrary/2006/main" mc:Ignorable="w14 w15 w16se">
-  <w:defaultTabStop w:val="708"/>
-  <w:hyphenationZone w:val="425"/>
-  <w:characterSpacingControl w:val="doNotCompress"/>
-  <w:compat>
-    <w:useFELayout/>
-    <w:compatSetting w:name="compatibilityMode" w:uri="http://schemas.microsoft.com/office/word" w:val="12"/>
-  </w:compat>
-  <w:rsids>
-    <w:rsidRoot w:val="004A7892"/>
-    <w:rsid w:val="004A7892"/>
-  </w:rsids>
-  <m:mathPr>
-    <m:mathFont m:val="Cambria Math"/>
-    <m:brkBin m:val="before"/>
-    <m:brkBinSub m:val="--"/>
-    <m:smallFrac m:val="0"/>
-    <m:dispDef/>
-    <m:lMargin m:val="0"/>
-    <m:rMargin m:val="0"/>
-    <m:defJc m:val="centerGroup"/>
-    <m:wrapIndent m:val="1440"/>
-    <m:intLim m:val="subSup"/>
-    <m:naryLim m:val="undOvr"/>
-  </m:mathPr>
-  <w:themeFontLang w:val="es-CL"/>
-  <w:clrSchemeMapping w:bg1="light1" w:t1="dark1" w:bg2="light2" w:t2="dark2" w:accent1="accent1" w:accent2="accent2" w:accent3="accent3" w:accent4="accent4" w:accent5="accent5" w:accent6="accent6" w:hyperlink="hyperlink" w:followedHyperlink="followedHyperlink"/>
-  <w:decimalSymbol w:val=","/>
-  <w:listSeparator w:val=";"/>
-</w:settings>
-</file>
-
-<file path=word/glossary/styles.xml><?xml version="1.0" encoding="utf-8"?>
-<w:styles xmlns:mc="http://schemas.openxmlformats.org/markup-compatibility/2006" xmlns:r="http://schemas.openxmlformats.org/officeDocument/2006/relationships" xmlns:w="http://schemas.openxmlformats.org/wordprocessingml/2006/main" xmlns:w14="http://schemas.microsoft.com/office/word/2010/wordml" xmlns:w15="http://schemas.microsoft.com/office/word/2012/wordml" xmlns:w16se="http://schemas.microsoft.com/office/word/2015/wordml/symex" mc:Ignorable="w14 w15 w16se">
-  <w:docDefaults>
-    <w:rPrDefault>
-      <w:rPr>
-        <w:rFonts w:asciiTheme="minorHAnsi" w:eastAsiaTheme="minorEastAsia" w:hAnsiTheme="minorHAnsi" w:cstheme="minorBidi"/>
-        <w:sz w:val="22"/>
-        <w:szCs w:val="22"/>
-        <w:lang w:val="es-CL" w:eastAsia="es-CL" w:bidi="ar-SA"/>
-      </w:rPr>
-    </w:rPrDefault>
-    <w:pPrDefault>
-      <w:pPr>
-        <w:spacing w:after="160" w:line="259" w:lineRule="auto"/>
-      </w:pPr>
-    </w:pPrDefault>
-  </w:docDefaults>
-  <w:latentStyles w:defLockedState="0" w:defUIPriority="99" w:defSemiHidden="0" w:defUnhideWhenUsed="0" w:defQFormat="0" w:count="371">
-    <w:lsdException w:name="Normal" w:uiPriority="0" w:qFormat="1"/>
-    <w:lsdException w:name="heading 1" w:uiPriority="9" w:qFormat="1"/>
-    <w:lsdException w:name="heading 2" w:semiHidden="1" w:uiPriority="9" w:unhideWhenUsed="1" w:qFormat="1"/>
-    <w:lsdException w:name="heading 3" w:semiHidden="1" w:uiPriority="9" w:unhideWhenUsed="1" w:qFormat="1"/>
-    <w:lsdException w:name="heading 4" w:semiHidden="1" w:uiPriority="9" w:unhideWhenUsed="1" w:qFormat="1"/>
-    <w:lsdException w:name="heading 5" w:semiHidden="1" w:uiPriority="9" w:unhideWhenUsed="1" w:qFormat="1"/>
-    <w:lsdException w:name="heading 6" w:semiHidden="1" w:uiPriority="9" w:unhideWhenUsed="1" w:qFormat="1"/>
-    <w:lsdException w:name="heading 7" w:semiHidden="1" w:uiPriority="9" w:unhideWhenUsed="1" w:qFormat="1"/>
-    <w:lsdException w:name="heading 8" w:semiHidden="1" w:uiPriority="9" w:unhideWhenUsed="1" w:qFormat="1"/>
-    <w:lsdException w:name="heading 9" w:semiHidden="1" w:uiPriority="9" w:unhideWhenUsed="1" w:qFormat="1"/>
-    <w:lsdException w:name="index 1" w:semiHidden="1" w:unhideWhenUsed="1"/>
-    <w:lsdException w:name="index 2" w:semiHidden="1" w:unhideWhenUsed="1"/>
-    <w:lsdException w:name="index 3" w:semiHidden="1" w:unhideWhenUsed="1"/>
-    <w:lsdException w:name="index 4" w:semiHidden="1" w:unhideWhenUsed="1"/>
-    <w:lsdException w:name="index 5" w:semiHidden="1" w:unhideWhenUsed="1"/>
-    <w:lsdException w:name="index 6" w:semiHidden="1" w:unhideWhenUsed="1"/>
-    <w:lsdException w:name="index 7" w:semiHidden="1" w:unhideWhenUsed="1"/>
-    <w:lsdException w:name="index 8" w:semiHidden="1" w:unhideWhenUsed="1"/>
-    <w:lsdException w:name="index 9" w:semiHidden="1" w:unhideWhenUsed="1"/>
-    <w:lsdException w:name="toc 1" w:semiHidden="1" w:uiPriority="39" w:unhideWhenUsed="1"/>
-    <w:lsdException w:name="toc 2" w:semiHidden="1" w:uiPriority="39" w:unhideWhenUsed="1"/>
-    <w:lsdException w:name="toc 3" w:semiHidden="1" w:uiPriority="39" w:unhideWhenUsed="1"/>
-    <w:lsdException w:name="toc 4" w:semiHidden="1" w:uiPriority="39" w:unhideWhenUsed="1"/>
-    <w:lsdException w:name="toc 5" w:semiHidden="1" w:uiPriority="39" w:unhideWhenUsed="1"/>
-    <w:lsdException w:name="toc 6" w:semiHidden="1" w:uiPriority="39" w:unhideWhenUsed="1"/>
-    <w:lsdException w:name="toc 7" w:semiHidden="1" w:uiPriority="39" w:unhideWhenUsed="1"/>
-    <w:lsdException w:name="toc 8" w:semiHidden="1" w:uiPriority="39" w:unhideWhenUsed="1"/>
-    <w:lsdException w:name="toc 9" w:semiHidden="1" w:uiPriority="39" w:unhideWhenUsed="1"/>
-    <w:lsdException w:name="Normal Indent" w:semiHidden="1" w:unhideWhenUsed="1"/>
-    <w:lsdException w:name="footnote text" w:semiHidden="1" w:unhideWhenUsed="1"/>
-    <w:lsdException w:name="annotation text" w:semiHidden="1" w:unhideWhenUsed="1"/>
-    <w:lsdException w:name="header" w:semiHidden="1" w:unhideWhenUsed="1"/>
-    <w:lsdException w:name="footer" w:semiHidden="1" w:unhideWhenUsed="1"/>
-    <w:lsdException w:name="index heading" w:semiHidden="1" w:unhideWhenUsed="1"/>
-    <w:lsdException w:name="caption" w:semiHidden="1" w:uiPriority="35" w:unhideWhenUsed="1" w:qFormat="1"/>
-    <w:lsdException w:name="table of figures" w:semiHidden="1" w:unhideWhenUsed="1"/>
-    <w:lsdException w:name="envelope address" w:semiHidden="1" w:unhideWhenUsed="1"/>
-    <w:lsdException w:name="envelope return" w:semiHidden="1" w:unhideWhenUsed="1"/>
-    <w:lsdException w:name="footnote reference" w:semiHidden="1" w:unhideWhenUsed="1"/>
-    <w:lsdException w:name="annotation reference" w:semiHidden="1" w:unhideWhenUsed="1"/>
-    <w:lsdException w:name="line number" w:semiHidden="1" w:unhideWhenUsed="1"/>
-    <w:lsdException w:name="page number" w:semiHidden="1" w:unhideWhenUsed="1"/>
-    <w:lsdException w:name="endnote reference" w:semiHidden="1" w:unhideWhenUsed="1"/>
-    <w:lsdException w:name="endnote text" w:semiHidden="1" w:unhideWhenUsed="1"/>
-    <w:lsdException w:name="table of authorities" w:semiHidden="1" w:unhideWhenUsed="1"/>
-    <w:lsdException w:name="macro" w:semiHidden="1" w:unhideWhenUsed="1"/>
-    <w:lsdException w:name="toa heading" w:semiHidden="1" w:unhideWhenUsed="1"/>
-    <w:lsdException w:name="List" w:semiHidden="1" w:unhideWhenUsed="1"/>
-    <w:lsdException w:name="List Bullet" w:semiHidden="1" w:unhideWhenUsed="1"/>
-    <w:lsdException w:name="List Number" w:semiHidden="1" w:unhideWhenUsed="1"/>
-    <w:lsdException w:name="List 2" w:semiHidden="1" w:unhideWhenUsed="1"/>
-    <w:lsdException w:name="List 3" w:semiHidden="1" w:unhideWhenUsed="1"/>
-    <w:lsdException w:name="List 4" w:semiHidden="1" w:unhideWhenUsed="1"/>
-    <w:lsdException w:name="List 5" w:semiHidden="1" w:unhideWhenUsed="1"/>
-    <w:lsdException w:name="List Bullet 2" w:semiHidden="1" w:unhideWhenUsed="1"/>
-    <w:lsdException w:name="List Bullet 3" w:semiHidden="1" w:unhideWhenUsed="1"/>
-    <w:lsdException w:name="List Bullet 4" w:semiHidden="1" w:unhideWhenUsed="1"/>
-    <w:lsdException w:name="List Bullet 5" w:semiHidden="1" w:unhideWhenUsed="1"/>
-    <w:lsdException w:name="List Number 2" w:semiHidden="1" w:unhideWhenUsed="1"/>
-    <w:lsdException w:name="List Number 3" w:semiHidden="1" w:unhideWhenUsed="1"/>
-    <w:lsdException w:name="List Number 4" w:semiHidden="1" w:unhideWhenUsed="1"/>
-    <w:lsdException w:name="List Number 5" w:semiHidden="1" w:unhideWhenUsed="1"/>
-    <w:lsdException w:name="Title" w:uiPriority="10" w:qFormat="1"/>
-    <w:lsdException w:name="Closing" w:semiHidden="1" w:unhideWhenUsed="1"/>
-    <w:lsdException w:name="Signature" w:semiHidden="1" w:unhideWhenUsed="1"/>
-    <w:lsdException w:name="Default Paragraph Font" w:semiHidden="1" w:uiPriority="1" w:unhideWhenUsed="1"/>
-    <w:lsdException w:name="Body Text" w:semiHidden="1" w:unhideWhenUsed="1"/>
-    <w:lsdException w:name="Body Text Indent" w:semiHidden="1" w:unhideWhenUsed="1"/>
-    <w:lsdException w:name="List Continue" w:semiHidden="1" w:unhideWhenUsed="1"/>
-    <w:lsdException w:name="List Continue 2" w:semiHidden="1" w:unhideWhenUsed="1"/>
-    <w:lsdException w:name="List Continue 3" w:semiHidden="1" w:unhideWhenUsed="1"/>
-    <w:lsdException w:name="List Continue 4" w:semiHidden="1" w:unhideWhenUsed="1"/>
-    <w:lsdException w:name="List Continue 5" w:semiHidden="1" w:unhideWhenUsed="1"/>
-    <w:lsdException w:name="Message Header" w:semiHidden="1" w:unhideWhenUsed="1"/>
-    <w:lsdException w:name="Subtitle" w:uiPriority="11" w:qFormat="1"/>
-    <w:lsdException w:name="Salutation" w:semiHidden="1" w:unhideWhenUsed="1"/>
-    <w:lsdException w:name="Date" w:semiHidden="1" w:unhideWhenUsed="1"/>
-    <w:lsdException w:name="Body Text First Indent" w:semiHidden="1" w:unhideWhenUsed="1"/>
-    <w:lsdException w:name="Body Text First Indent 2" w:semiHidden="1" w:unhideWhenUsed="1"/>
-    <w:lsdException w:name="Note Heading" w:semiHidden="1" w:unhideWhenUsed="1"/>
-    <w:lsdException w:name="Body Text 2" w:semiHidden="1" w:unhideWhenUsed="1"/>
-    <w:lsdException w:name="Body Text 3" w:semiHidden="1" w:unhideWhenUsed="1"/>
-    <w:lsdException w:name="Body Text Indent 2" w:semiHidden="1" w:unhideWhenUsed="1"/>
-    <w:lsdException w:name="Body Text Indent 3" w:semiHidden="1" w:unhideWhenUsed="1"/>
-    <w:lsdException w:name="Block Text" w:semiHidden="1" w:unhideWhenUsed="1"/>
-    <w:lsdException w:name="Hyperlink" w:semiHidden="1" w:unhideWhenUsed="1"/>
-    <w:lsdException w:name="FollowedHyperlink" w:semiHidden="1" w:unhideWhenUsed="1"/>
-    <w:lsdException w:name="Strong" w:uiPriority="22" w:qFormat="1"/>
-    <w:lsdException w:name="Emphasis" w:uiPriority="20" w:qFormat="1"/>
-    <w:lsdException w:name="Document Map" w:semiHidden="1" w:unhideWhenUsed="1"/>
-    <w:lsdException w:name="Plain Text" w:semiHidden="1" w:unhideWhenUsed="1"/>
-    <w:lsdException w:name="E-mail Signature" w:semiHidden="1" w:unhideWhenUsed="1"/>
-    <w:lsdException w:name="HTML Top of Form" w:semiHidden="1" w:unhideWhenUsed="1"/>
-    <w:lsdException w:name="HTML Bottom of Form" w:semiHidden="1" w:unhideWhenUsed="1"/>
-    <w:lsdException w:name="Normal (Web)" w:semiHidden="1" w:unhideWhenUsed="1"/>
-    <w:lsdException w:name="HTML Acronym" w:semiHidden="1" w:unhideWhenUsed="1"/>
-    <w:lsdException w:name="HTML Address" w:semiHidden="1" w:unhideWhenUsed="1"/>
-    <w:lsdException w:name="HTML Cite" w:semiHidden="1" w:unhideWhenUsed="1"/>
-    <w:lsdException w:name="HTML Code" w:semiHidden="1" w:unhideWhenUsed="1"/>
-    <w:lsdException w:name="HTML Definition" w:semiHidden="1" w:unhideWhenUsed="1"/>
-    <w:lsdException w:name="HTML Keyboard" w:semiHidden="1" w:unhideWhenUsed="1"/>
-    <w:lsdException w:name="HTML Preformatted" w:semiHidden="1" w:unhideWhenUsed="1"/>
-    <w:lsdException w:name="HTML Sample" w:semiHidden="1" w:unhideWhenUsed="1"/>
-    <w:lsdException w:name="HTML Typewriter" w:semiHidden="1" w:unhideWhenUsed="1"/>
-    <w:lsdException w:name="HTML Variable" w:semiHidden="1" w:unhideWhenUsed="1"/>
-    <w:lsdException w:name="Normal Table" w:semiHidden="1" w:unhideWhenUsed="1"/>
-    <w:lsdException w:name="annotation subject" w:semiHidden="1" w:unhideWhenUsed="1"/>
-    <w:lsdException w:name="No List" w:semiHidden="1" w:unhideWhenUsed="1"/>
-    <w:lsdException w:name="Outline List 1" w:semiHidden="1" w:unhideWhenUsed="1"/>
-    <w:lsdException w:name="Outline List 2" w:semiHidden="1" w:unhideWhenUsed="1"/>
-    <w:lsdException w:name="Outline List 3" w:semiHidden="1" w:unhideWhenUsed="1"/>
-    <w:lsdException w:name="Table Simple 1" w:semiHidden="1" w:unhideWhenUsed="1"/>
-    <w:lsdException w:name="Table Simple 2" w:semiHidden="1" w:unhideWhenUsed="1"/>
-    <w:lsdException w:name="Table Simple 3" w:semiHidden="1" w:unhideWhenUsed="1"/>
-    <w:lsdException w:name="Table Classic 1" w:semiHidden="1" w:unhideWhenUsed="1"/>
-    <w:lsdException w:name="Table Classic 2" w:semiHidden="1" w:unhideWhenUsed="1"/>
-    <w:lsdException w:name="Table Classic 3" w:semiHidden="1" w:unhideWhenUsed="1"/>
-    <w:lsdException w:name="Table Classic 4" w:semiHidden="1" w:unhideWhenUsed="1"/>
-    <w:lsdException w:name="Table Colorful 1" w:semiHidden="1" w:unhideWhenUsed="1"/>
-    <w:lsdException w:name="Table Colorful 2" w:semiHidden="1" w:unhideWhenUsed="1"/>
-    <w:lsdException w:name="Table Colorful 3" w:semiHidden="1" w:unhideWhenUsed="1"/>
-    <w:lsdException w:name="Table Columns 1" w:semiHidden="1" w:unhideWhenUsed="1"/>
-    <w:lsdException w:name="Table Columns 2" w:semiHidden="1" w:unhideWhenUsed="1"/>
-    <w:lsdException w:name="Table Columns 3" w:semiHidden="1" w:unhideWhenUsed="1"/>
-    <w:lsdException w:name="Table Columns 4" w:semiHidden="1" w:unhideWhenUsed="1"/>
-    <w:lsdException w:name="Table Columns 5" w:semiHidden="1" w:unhideWhenUsed="1"/>
-    <w:lsdException w:name="Table Grid 1" w:semiHidden="1" w:unhideWhenUsed="1"/>
-    <w:lsdException w:name="Table Grid 2" w:semiHidden="1" w:unhideWhenUsed="1"/>
-    <w:lsdException w:name="Table Grid 3" w:semiHidden="1" w:unhideWhenUsed="1"/>
-    <w:lsdException w:name="Table Grid 4" w:semiHidden="1" w:unhideWhenUsed="1"/>
-    <w:lsdException w:name="Table Grid 5" w:semiHidden="1" w:unhideWhenUsed="1"/>
-    <w:lsdException w:name="Table Grid 6" w:semiHidden="1" w:unhideWhenUsed="1"/>
-    <w:lsdException w:name="Table Grid 7" w:semiHidden="1" w:unhideWhenUsed="1"/>
-    <w:lsdException w:name="Table Grid 8" w:semiHidden="1" w:unhideWhenUsed="1"/>
-    <w:lsdException w:name="Table List 1" w:semiHidden="1" w:unhideWhenUsed="1"/>
-    <w:lsdException w:name="Table List 2" w:semiHidden="1" w:unhideWhenUsed="1"/>
-    <w:lsdException w:name="Table List 3" w:semiHidden="1" w:unhideWhenUsed="1"/>
-    <w:lsdException w:name="Table List 4" w:semiHidden="1" w:unhideWhenUsed="1"/>
-    <w:lsdException w:name="Table List 5" w:semiHidden="1" w:unhideWhenUsed="1"/>
-    <w:lsdException w:name="Table List 6" w:semiHidden="1" w:unhideWhenUsed="1"/>
-    <w:lsdException w:name="Table List 7" w:semiHidden="1" w:unhideWhenUsed="1"/>
-    <w:lsdException w:name="Table List 8" w:semiHidden="1" w:unhideWhenUsed="1"/>
-    <w:lsdException w:name="Table 3D effects 1" w:semiHidden="1" w:unhideWhenUsed="1"/>
-    <w:lsdException w:name="Table 3D effects 2" w:semiHidden="1" w:unhideWhenUsed="1"/>
-    <w:lsdException w:name="Table 3D effects 3" w:semiHidden="1" w:unhideWhenUsed="1"/>
-    <w:lsdException w:name="Table Contemporary" w:semiHidden="1" w:unhideWhenUsed="1"/>
-    <w:lsdException w:name="Table Elegant" w:semiHidden="1" w:unhideWhenUsed="1"/>
-    <w:lsdException w:name="Table Professional" w:semiHidden="1" w:unhideWhenUsed="1"/>
-    <w:lsdException w:name="Table Subtle 1" w:semiHidden="1" w:unhideWhenUsed="1"/>
-    <w:lsdException w:name="Table Subtle 2" w:semiHidden="1" w:unhideWhenUsed="1"/>
-    <w:lsdException w:name="Table Web 1" w:semiHidden="1" w:unhideWhenUsed="1"/>
-    <w:lsdException w:name="Table Web 2" w:semiHidden="1" w:unhideWhenUsed="1"/>
-    <w:lsdException w:name="Table Web 3" w:semiHidden="1" w:unhideWhenUsed="1"/>
-    <w:lsdException w:name="Balloon Text" w:semiHidden="1" w:unhideWhenUsed="1"/>
-    <w:lsdException w:name="Table Grid" w:uiPriority="39"/>
-    <w:lsdException w:name="Table Theme" w:semiHidden="1" w:unhideWhenUsed="1"/>
-    <w:lsdException w:name="Placeholder Text" w:semiHidden="1"/>
-    <w:lsdException w:name="No Spacing" w:uiPriority="1" w:qFormat="1"/>
-    <w:lsdException w:name="Light Shading" w:uiPriority="60"/>
-    <w:lsdException w:name="Light List" w:uiPriority="61"/>
-    <w:lsdException w:name="Light Grid" w:uiPriority="62"/>
-    <w:lsdException w:name="Medium Shading 1" w:uiPriority="63"/>
-    <w:lsdException w:name="Medium Shading 2" w:uiPriority="64"/>
-    <w:lsdException w:name="Medium List 1" w:uiPriority="65"/>
-    <w:lsdException w:name="Medium List 2" w:uiPriority="66"/>
-    <w:lsdException w:name="Medium Grid 1" w:uiPriority="67"/>
-    <w:lsdException w:name="Medium Grid 2" w:uiPriority="68"/>
-    <w:lsdException w:name="Medium Grid 3" w:uiPriority="69"/>
-    <w:lsdException w:name="Dark List" w:uiPriority="70"/>
-    <w:lsdException w:name="Colorful Shading" w:uiPriority="71"/>
-    <w:lsdException w:name="Colorful List" w:uiPriority="72"/>
-    <w:lsdException w:name="Colorful Grid" w:uiPriority="73"/>
-    <w:lsdException w:name="Light Shading Accent 1" w:uiPriority="60"/>
-    <w:lsdException w:name="Light List Accent 1" w:uiPriority="61"/>
-    <w:lsdException w:name="Light Grid Accent 1" w:uiPriority="62"/>
-    <w:lsdException w:name="Medium Shading 1 Accent 1" w:uiPriority="63"/>
-    <w:lsdException w:name="Medium Shading 2 Accent 1" w:uiPriority="64"/>
-    <w:lsdException w:name="Medium List 1 Accent 1" w:uiPriority="65"/>
-    <w:lsdException w:name="Revision" w:semiHidden="1"/>
-    <w:lsdException w:name="List Paragraph" w:uiPriority="34" w:qFormat="1"/>
-    <w:lsdException w:name="Quote" w:uiPriority="29" w:qFormat="1"/>
-    <w:lsdException w:name="Intense Quote" w:uiPriority="30" w:qFormat="1"/>
-    <w:lsdException w:name="Medium List 2 Accent 1" w:uiPriority="66"/>
-    <w:lsdException w:name="Medium Grid 1 Accent 1" w:uiPriority="67"/>
-    <w:lsdException w:name="Medium Grid 2 Accent 1" w:uiPriority="68"/>
-    <w:lsdException w:name="Medium Grid 3 Accent 1" w:uiPriority="69"/>
-    <w:lsdException w:name="Dark List Accent 1" w:uiPriority="70"/>
-    <w:lsdException w:name="Colorful Shading Accent 1" w:uiPriority="71"/>
-    <w:lsdException w:name="Colorful List Accent 1" w:uiPriority="72"/>
-    <w:lsdException w:name="Colorful Grid Accent 1" w:uiPriority="73"/>
-    <w:lsdException w:name="Light Shading Accent 2" w:uiPriority="60"/>
-    <w:lsdException w:name="Light List Accent 2" w:uiPriority="61"/>
-    <w:lsdException w:name="Light Grid Accent 2" w:uiPriority="62"/>
-    <w:lsdException w:name="Medium Shading 1 Accent 2" w:uiPriority="63"/>
-    <w:lsdException w:name="Medium Shading 2 Accent 2" w:uiPriority="64"/>
-    <w:lsdException w:name="Medium List 1 Accent 2" w:uiPriority="65"/>
-    <w:lsdException w:name="Medium List 2 Accent 2" w:uiPriority="66"/>
-    <w:lsdException w:name="Medium Grid 1 Accent 2" w:uiPriority="67"/>
-    <w:lsdException w:name="Medium Grid 2 Accent 2" w:uiPriority="68"/>
-    <w:lsdException w:name="Medium Grid 3 Accent 2" w:uiPriority="69"/>
-    <w:lsdException w:name="Dark List Accent 2" w:uiPriority="70"/>
-    <w:lsdException w:name="Colorful Shading Accent 2" w:uiPriority="71"/>
-    <w:lsdException w:name="Colorful List Accent 2" w:uiPriority="72"/>
-    <w:lsdException w:name="Colorful Grid Accent 2" w:uiPriority="73"/>
-    <w:lsdException w:name="Light Shading Accent 3" w:uiPriority="60"/>
-    <w:lsdException w:name="Light List Accent 3" w:uiPriority="61"/>
-    <w:lsdException w:name="Light Grid Accent 3" w:uiPriority="62"/>
-    <w:lsdException w:name="Medium Shading 1 Accent 3" w:uiPriority="63"/>
-    <w:lsdException w:name="Medium Shading 2 Accent 3" w:uiPriority="64"/>
-    <w:lsdException w:name="Medium List 1 Accent 3" w:uiPriority="65"/>
-    <w:lsdException w:name="Medium List 2 Accent 3" w:uiPriority="66"/>
-    <w:lsdException w:name="Medium Grid 1 Accent 3" w:uiPriority="67"/>
-    <w:lsdException w:name="Medium Grid 2 Accent 3" w:uiPriority="68"/>
-    <w:lsdException w:name="Medium Grid 3 Accent 3" w:uiPriority="69"/>
-    <w:lsdException w:name="Dark List Accent 3" w:uiPriority="70"/>
-    <w:lsdException w:name="Colorful Shading Accent 3" w:uiPriority="71"/>
-    <w:lsdException w:name="Colorful List Accent 3" w:uiPriority="72"/>
-    <w:lsdException w:name="Colorful Grid Accent 3" w:uiPriority="73"/>
-    <w:lsdException w:name="Light Shading Accent 4" w:uiPriority="60"/>
-    <w:lsdException w:name="Light List Accent 4" w:uiPriority="61"/>
-    <w:lsdException w:name="Light Grid Accent 4" w:uiPriority="62"/>
-    <w:lsdException w:name="Medium Shading 1 Accent 4" w:uiPriority="63"/>
-    <w:lsdException w:name="Medium Shading 2 Accent 4" w:uiPriority="64"/>
-    <w:lsdException w:name="Medium List 1 Accent 4" w:uiPriority="65"/>
-    <w:lsdException w:name="Medium List 2 Accent 4" w:uiPriority="66"/>
-    <w:lsdException w:name="Medium Grid 1 Accent 4" w:uiPriority="67"/>
-    <w:lsdException w:name="Medium Grid 2 Accent 4" w:uiPriority="68"/>
-    <w:lsdException w:name="Medium Grid 3 Accent 4" w:uiPriority="69"/>
-    <w:lsdException w:name="Dark List Accent 4" w:uiPriority="70"/>
-    <w:lsdException w:name="Colorful Shading Accent 4" w:uiPriority="71"/>
-    <w:lsdException w:name="Colorful List Accent 4" w:uiPriority="72"/>
-    <w:lsdException w:name="Colorful Grid Accent 4" w:uiPriority="73"/>
-    <w:lsdException w:name="Light Shading Accent 5" w:uiPriority="60"/>
-    <w:lsdException w:name="Light List Accent 5" w:uiPriority="61"/>
-    <w:lsdException w:name="Light Grid Accent 5" w:uiPriority="62"/>
-    <w:lsdException w:name="Medium Shading 1 Accent 5" w:uiPriority="63"/>
-    <w:lsdException w:name="Medium Shading 2 Accent 5" w:uiPriority="64"/>
-    <w:lsdException w:name="Medium List 1 Accent 5" w:uiPriority="65"/>
-    <w:lsdException w:name="Medium List 2 Accent 5" w:uiPriority="66"/>
-    <w:lsdException w:name="Medium Grid 1 Accent 5" w:uiPriority="67"/>
-    <w:lsdException w:name="Medium Grid 2 Accent 5" w:uiPriority="68"/>
-    <w:lsdException w:name="Medium Grid 3 Accent 5" w:uiPriority="69"/>
-    <w:lsdException w:name="Dark List Accent 5" w:uiPriority="70"/>
-    <w:lsdException w:name="Colorful Shading Accent 5" w:uiPriority="71"/>
-    <w:lsdException w:name="Colorful List Accent 5" w:uiPriority="72"/>
-    <w:lsdException w:name="Colorful Grid Accent 5" w:uiPriority="73"/>
-    <w:lsdException w:name="Light Shading Accent 6" w:uiPriority="60"/>
-    <w:lsdException w:name="Light List Accent 6" w:uiPriority="61"/>
-    <w:lsdException w:name="Light Grid Accent 6" w:uiPriority="62"/>
-    <w:lsdException w:name="Medium Shading 1 Accent 6" w:uiPriority="63"/>
-    <w:lsdException w:name="Medium Shading 2 Accent 6" w:uiPriority="64"/>
-    <w:lsdException w:name="Medium List 1 Accent 6" w:uiPriority="65"/>
-    <w:lsdException w:name="Medium List 2 Accent 6" w:uiPriority="66"/>
-    <w:lsdException w:name="Medium Grid 1 Accent 6" w:uiPriority="67"/>
-    <w:lsdException w:name="Medium Grid 2 Accent 6" w:uiPriority="68"/>
-    <w:lsdException w:name="Medium Grid 3 Accent 6" w:uiPriority="69"/>
-    <w:lsdException w:name="Dark List Accent 6" w:uiPriority="70"/>
-    <w:lsdException w:name="Colorful Shading Accent 6" w:uiPriority="71"/>
-    <w:lsdException w:name="Colorful List Accent 6" w:uiPriority="72"/>
-    <w:lsdException w:name="Colorful Grid Accent 6" w:uiPriority="73"/>
-    <w:lsdException w:name="Subtle Emphasis" w:uiPriority="19" w:qFormat="1"/>
-    <w:lsdException w:name="Intense Emphasis" w:uiPriority="21" w:qFormat="1"/>
-    <w:lsdException w:name="Subtle Reference" w:uiPriority="31" w:qFormat="1"/>
-    <w:lsdException w:name="Intense Reference" w:uiPriority="32" w:qFormat="1"/>
-    <w:lsdException w:name="Book Title" w:uiPriority="33" w:qFormat="1"/>
-    <w:lsdException w:name="Bibliography" w:semiHidden="1" w:uiPriority="37" w:unhideWhenUsed="1"/>
-    <w:lsdException w:name="TOC Heading" w:semiHidden="1" w:uiPriority="39" w:unhideWhenUsed="1" w:qFormat="1"/>
-    <w:lsdException w:name="Plain Table 1" w:uiPriority="41"/>
-    <w:lsdException w:name="Plain Table 2" w:uiPriority="42"/>
-    <w:lsdException w:name="Plain Table 3" w:uiPriority="43"/>
-    <w:lsdException w:name="Plain Table 4" w:uiPriority="44"/>
-    <w:lsdException w:name="Plain Table 5" w:uiPriority="45"/>
-    <w:lsdException w:name="Grid Table Light" w:uiPriority="40"/>
-    <w:lsdException w:name="Grid Table 1 Light" w:uiPriority="46"/>
-    <w:lsdException w:name="Grid Table 2" w:uiPriority="47"/>
-    <w:lsdException w:name="Grid Table 3" w:uiPriority="48"/>
-    <w:lsdException w:name="Grid Table 4" w:uiPriority="49"/>
-    <w:lsdException w:name="Grid Table 5 Dark" w:uiPriority="50"/>
-    <w:lsdException w:name="Grid Table 6 Colorful" w:uiPriority="51"/>
-    <w:lsdException w:name="Grid Table 7 Colorful" w:uiPriority="52"/>
-    <w:lsdException w:name="Grid Table 1 Light Accent 1" w:uiPriority="46"/>
-    <w:lsdException w:name="Grid Table 2 Accent 1" w:uiPriority="47"/>
-    <w:lsdException w:name="Grid Table 3 Accent 1" w:uiPriority="48"/>
-    <w:lsdException w:name="Grid Table 4 Accent 1" w:uiPriority="49"/>
-    <w:lsdException w:name="Grid Table 5 Dark Accent 1" w:uiPriority="50"/>
-    <w:lsdException w:name="Grid Table 6 Colorful Accent 1" w:uiPriority="51"/>
-    <w:lsdException w:name="Grid Table 7 Colorful Accent 1" w:uiPriority="52"/>
-    <w:lsdException w:name="Grid Table 1 Light Accent 2" w:uiPriority="46"/>
-    <w:lsdException w:name="Grid Table 2 Accent 2" w:uiPriority="47"/>
-    <w:lsdException w:name="Grid Table 3 Accent 2" w:uiPriority="48"/>
-    <w:lsdException w:name="Grid Table 4 Accent 2" w:uiPriority="49"/>
-    <w:lsdException w:name="Grid Table 5 Dark Accent 2" w:uiPriority="50"/>
-    <w:lsdException w:name="Grid Table 6 Colorful Accent 2" w:uiPriority="51"/>
-    <w:lsdException w:name="Grid Table 7 Colorful Accent 2" w:uiPriority="52"/>
-    <w:lsdException w:name="Grid Table 1 Light Accent 3" w:uiPriority="46"/>
-    <w:lsdException w:name="Grid Table 2 Accent 3" w:uiPriority="47"/>
-    <w:lsdException w:name="Grid Table 3 Accent 3" w:uiPriority="48"/>
-    <w:lsdException w:name="Grid Table 4 Accent 3" w:uiPriority="49"/>
-    <w:lsdException w:name="Grid Table 5 Dark Accent 3" w:uiPriority="50"/>
-    <w:lsdException w:name="Grid Table 6 Colorful Accent 3" w:uiPriority="51"/>
-    <w:lsdException w:name="Grid Table 7 Colorful Accent 3" w:uiPriority="52"/>
-    <w:lsdException w:name="Grid Table 1 Light Accent 4" w:uiPriority="46"/>
-    <w:lsdException w:name="Grid Table 2 Accent 4" w:uiPriority="47"/>
-    <w:lsdException w:name="Grid Table 3 Accent 4" w:uiPriority="48"/>
-    <w:lsdException w:name="Grid Table 4 Accent 4" w:uiPriority="49"/>
-    <w:lsdException w:name="Grid Table 5 Dark Accent 4" w:uiPriority="50"/>
-    <w:lsdException w:name="Grid Table 6 Colorful Accent 4" w:uiPriority="51"/>
-    <w:lsdException w:name="Grid Table 7 Colorful Accent 4" w:uiPriority="52"/>
-    <w:lsdException w:name="Grid Table 1 Light Accent 5" w:uiPriority="46"/>
-    <w:lsdException w:name="Grid Table 2 Accent 5" w:uiPriority="47"/>
-    <w:lsdException w:name="Grid Table 3 Accent 5" w:uiPriority="48"/>
-    <w:lsdException w:name="Grid Table 4 Accent 5" w:uiPriority="49"/>
-    <w:lsdException w:name="Grid Table 5 Dark Accent 5" w:uiPriority="50"/>
-    <w:lsdException w:name="Grid Table 6 Colorful Accent 5" w:uiPriority="51"/>
-    <w:lsdException w:name="Grid Table 7 Colorful Accent 5" w:uiPriority="52"/>
-    <w:lsdException w:name="Grid Table 1 Light Accent 6" w:uiPriority="46"/>
-    <w:lsdException w:name="Grid Table 2 Accent 6" w:uiPriority="47"/>
-    <w:lsdException w:name="Grid Table 3 Accent 6" w:uiPriority="48"/>
-    <w:lsdException w:name="Grid Table 4 Accent 6" w:uiPriority="49"/>
-    <w:lsdException w:name="Grid Table 5 Dark Accent 6" w:uiPriority="50"/>
-    <w:lsdException w:name="Grid Table 6 Colorful Accent 6" w:uiPriority="51"/>
-    <w:lsdException w:name="Grid Table 7 Colorful Accent 6" w:uiPriority="52"/>
-    <w:lsdException w:name="List Table 1 Light" w:uiPriority="46"/>
-    <w:lsdException w:name="List Table 2" w:uiPriority="47"/>
-    <w:lsdException w:name="List Table 3" w:uiPriority="48"/>
-    <w:lsdException w:name="List Table 4" w:uiPriority="49"/>
-    <w:lsdException w:name="List Table 5 Dark" w:uiPriority="50"/>
-    <w:lsdException w:name="List Table 6 Colorful" w:uiPriority="51"/>
-    <w:lsdException w:name="List Table 7 Colorful" w:uiPriority="52"/>
-    <w:lsdException w:name="List Table 1 Light Accent 1" w:uiPriority="46"/>
-    <w:lsdException w:name="List Table 2 Accent 1" w:uiPriority="47"/>
-    <w:lsdException w:name="List Table 3 Accent 1" w:uiPriority="48"/>
-    <w:lsdException w:name="List Table 4 Accent 1" w:uiPriority="49"/>
-    <w:lsdException w:name="List Table 5 Dark Accent 1" w:uiPriority="50"/>
-    <w:lsdException w:name="List Table 6 Colorful Accent 1" w:uiPriority="51"/>
-    <w:lsdException w:name="List Table 7 Colorful Accent 1" w:uiPriority="52"/>
-    <w:lsdException w:name="List Table 1 Light Accent 2" w:uiPriority="46"/>
-    <w:lsdException w:name="List Table 2 Accent 2" w:uiPriority="47"/>
-    <w:lsdException w:name="List Table 3 Accent 2" w:uiPriority="48"/>
-    <w:lsdException w:name="List Table 4 Accent 2" w:uiPriority="49"/>
-    <w:lsdException w:name="List Table 5 Dark Accent 2" w:uiPriority="50"/>
-    <w:lsdException w:name="List Table 6 Colorful Accent 2" w:uiPriority="51"/>
-    <w:lsdException w:name="List Table 7 Colorful Accent 2" w:uiPriority="52"/>
-    <w:lsdException w:name="List Table 1 Light Accent 3" w:uiPriority="46"/>
-    <w:lsdException w:name="List Table 2 Accent 3" w:uiPriority="47"/>
-    <w:lsdException w:name="List Table 3 Accent 3" w:uiPriority="48"/>
-    <w:lsdException w:name="List Table 4 Accent 3" w:uiPriority="49"/>
-    <w:lsdException w:name="List Table 5 Dark Accent 3" w:uiPriority="50"/>
-    <w:lsdException w:name="List Table 6 Colorful Accent 3" w:uiPriority="51"/>
-    <w:lsdException w:name="List Table 7 Colorful Accent 3" w:uiPriority="52"/>
-    <w:lsdException w:name="List Table 1 Light Accent 4" w:uiPriority="46"/>
-    <w:lsdException w:name="List Table 2 Accent 4" w:uiPriority="47"/>
-    <w:lsdException w:name="List Table 3 Accent 4" w:uiPriority="48"/>
-    <w:lsdException w:name="List Table 4 Accent 4" w:uiPriority="49"/>
-    <w:lsdException w:name="List Table 5 Dark Accent 4" w:uiPriority="50"/>
-    <w:lsdException w:name="List Table 6 Colorful Accent 4" w:uiPriority="51"/>
-    <w:lsdException w:name="List Table 7 Colorful Accent 4" w:uiPriority="52"/>
-    <w:lsdException w:name="List Table 1 Light Accent 5" w:uiPriority="46"/>
-    <w:lsdException w:name="List Table 2 Accent 5" w:uiPriority="47"/>
-    <w:lsdException w:name="List Table 3 Accent 5" w:uiPriority="48"/>
-    <w:lsdException w:name="List Table 4 Accent 5" w:uiPriority="49"/>
-    <w:lsdException w:name="List Table 5 Dark Accent 5" w:uiPriority="50"/>
-    <w:lsdException w:name="List Table 6 Colorful Accent 5" w:uiPriority="51"/>
-    <w:lsdException w:name="List Table 7 Colorful Accent 5" w:uiPriority="52"/>
-    <w:lsdException w:name="List Table 1 Light Accent 6" w:uiPriority="46"/>
-    <w:lsdException w:name="List Table 2 Accent 6" w:uiPriority="47"/>
-    <w:lsdException w:name="List Table 3 Accent 6" w:uiPriority="48"/>
-    <w:lsdException w:name="List Table 4 Accent 6" w:uiPriority="49"/>
-    <w:lsdException w:name="List Table 5 Dark Accent 6" w:uiPriority="50"/>
-    <w:lsdException w:name="List Table 6 Colorful Accent 6" w:uiPriority="51"/>
-    <w:lsdException w:name="List Table 7 Colorful Accent 6" w:uiPriority="52"/>
-  </w:latentStyles>
-  <w:style w:type="paragraph" w:default="1" w:styleId="Normal">
-    <w:name w:val="Normal"/>
-    <w:qFormat/>
-  </w:style>
-  <w:style w:type="character" w:default="1" w:styleId="Fuentedeprrafopredeter">
-    <w:name w:val="Default Paragraph Font"/>
-    <w:uiPriority w:val="1"/>
-    <w:semiHidden/>
-    <w:unhideWhenUsed/>
-  </w:style>
-  <w:style w:type="table" w:default="1" w:styleId="Tablanormal">
-    <w:name w:val="Normal Table"/>
-    <w:uiPriority w:val="99"/>
-    <w:semiHidden/>
-    <w:unhideWhenUsed/>
-    <w:tblPr>
-      <w:tblInd w:w="0" w:type="dxa"/>
-      <w:tblCellMar>
-        <w:top w:w="0" w:type="dxa"/>
-        <w:left w:w="108" w:type="dxa"/>
-        <w:bottom w:w="0" w:type="dxa"/>
-        <w:right w:w="108" w:type="dxa"/>
-      </w:tblCellMar>
-    </w:tblPr>
-  </w:style>
-  <w:style w:type="numbering" w:default="1" w:styleId="Sinlista">
-    <w:name w:val="No List"/>
-    <w:uiPriority w:val="99"/>
-    <w:semiHidden/>
-    <w:unhideWhenUsed/>
-  </w:style>
-</w:styles>
-</file>
-
-<file path=word/glossary/webSettings.xml><?xml version="1.0" encoding="utf-8"?>
-<w:webSettings xmlns:mc="http://schemas.openxmlformats.org/markup-compatibility/2006" xmlns:r="http://schemas.openxmlformats.org/officeDocument/2006/relationships" xmlns:w="http://schemas.openxmlformats.org/wordprocessingml/2006/main" xmlns:w14="http://schemas.microsoft.com/office/word/2010/wordml" xmlns:w15="http://schemas.microsoft.com/office/word/2012/wordml" xmlns:w16se="http://schemas.microsoft.com/office/word/2015/wordml/symex" mc:Ignorable="w14 w15 w16se"/>
 </file>
 
 <file path=word/theme/theme1.xml><?xml version="1.0" encoding="utf-8"?>
@@ -9929,15 +9609,6 @@
 </file>
 
 <file path=customXml/item1.xml><?xml version="1.0" encoding="utf-8"?>
-<?mso-contentType ?>
-<FormTemplates xmlns="http://schemas.microsoft.com/sharepoint/v3/contenttype/forms">
-  <Display>DocumentLibraryForm</Display>
-  <Edit>DocumentLibraryForm</Edit>
-  <New>DocumentLibraryForm</New>
-</FormTemplates>
-</file>
-
-<file path=customXml/item2.xml><?xml version="1.0" encoding="utf-8"?>
 <ct:contentTypeSchema xmlns:ct="http://schemas.microsoft.com/office/2006/metadata/contentType" xmlns:ma="http://schemas.microsoft.com/office/2006/metadata/properties/metaAttributes" ct:_="" ma:_="" ma:contentTypeName="Documento" ma:contentTypeID="0x010100E96778489EE7714D8BD12CC105EB918B" ma:contentTypeVersion="2" ma:contentTypeDescription="Crear nuevo documento." ma:contentTypeScope="" ma:versionID="416c5c7ae9b5d54d83875cd3c65194e3">
   <xsd:schema xmlns:xsd="http://www.w3.org/2001/XMLSchema" xmlns:xs="http://www.w3.org/2001/XMLSchema" xmlns:p="http://schemas.microsoft.com/office/2006/metadata/properties" xmlns:ns2="126e8a1c-9ea9-435a-ac89-d06c80d62e30" targetNamespace="http://schemas.microsoft.com/office/2006/metadata/properties" ma:root="true" ma:fieldsID="70a237c842677bd850644f8595079f5e" ns2:_="">
     <xsd:import namespace="126e8a1c-9ea9-435a-ac89-d06c80d62e30"/>
@@ -10069,25 +9740,26 @@
 </ct:contentTypeSchema>
 </file>
 
+<file path=customXml/item2.xml><?xml version="1.0" encoding="utf-8"?>
+<?mso-contentType ?>
+<FormTemplates xmlns="http://schemas.microsoft.com/sharepoint/v3/contenttype/forms">
+  <Display>DocumentLibraryForm</Display>
+  <Edit>DocumentLibraryForm</Edit>
+  <New>DocumentLibraryForm</New>
+</FormTemplates>
+</file>
+
 <file path=customXml/item3.xml><?xml version="1.0" encoding="utf-8"?>
+<b:Sources xmlns:b="http://schemas.openxmlformats.org/officeDocument/2006/bibliography" xmlns="http://schemas.openxmlformats.org/officeDocument/2006/bibliography" SelectedStyle="\APASixthEditionOfficeOnline.xsl" StyleName="APA" Version="6"/>
+</file>
+
+<file path=customXml/item4.xml><?xml version="1.0" encoding="utf-8"?>
 <p:properties xmlns:p="http://schemas.microsoft.com/office/2006/metadata/properties" xmlns:xsi="http://www.w3.org/2001/XMLSchema-instance" xmlns:pc="http://schemas.microsoft.com/office/infopath/2007/PartnerControls">
   <documentManagement/>
 </p:properties>
 </file>
 
-<file path=customXml/item4.xml><?xml version="1.0" encoding="utf-8"?>
-<b:Sources xmlns:b="http://schemas.openxmlformats.org/officeDocument/2006/bibliography" xmlns="http://schemas.openxmlformats.org/officeDocument/2006/bibliography" SelectedStyle="\APASixthEditionOfficeOnline.xsl" StyleName="APA" Version="6"/>
-</file>
-
 <file path=customXml/itemProps1.xml><?xml version="1.0" encoding="utf-8"?>
-<ds:datastoreItem xmlns:ds="http://schemas.openxmlformats.org/officeDocument/2006/customXml" ds:itemID="{DABAA964-10BA-4DBC-ABF2-CDEAC0FAF7AA}">
-  <ds:schemaRefs>
-    <ds:schemaRef ds:uri="http://schemas.microsoft.com/sharepoint/v3/contenttype/forms"/>
-  </ds:schemaRefs>
-</ds:datastoreItem>
-</file>
-
-<file path=customXml/itemProps2.xml><?xml version="1.0" encoding="utf-8"?>
 <ds:datastoreItem xmlns:ds="http://schemas.openxmlformats.org/officeDocument/2006/customXml" ds:itemID="{90673534-9590-47F8-B0D6-46AB217CB3AD}">
   <ds:schemaRefs>
     <ds:schemaRef ds:uri="http://schemas.microsoft.com/office/2006/metadata/contentType"/>
@@ -10105,26 +9777,27 @@
 </ds:datastoreItem>
 </file>
 
+<file path=customXml/itemProps2.xml><?xml version="1.0" encoding="utf-8"?>
+<ds:datastoreItem xmlns:ds="http://schemas.openxmlformats.org/officeDocument/2006/customXml" ds:itemID="{DABAA964-10BA-4DBC-ABF2-CDEAC0FAF7AA}">
+  <ds:schemaRefs>
+    <ds:schemaRef ds:uri="http://schemas.microsoft.com/sharepoint/v3/contenttype/forms"/>
+  </ds:schemaRefs>
+</ds:datastoreItem>
+</file>
+
 <file path=customXml/itemProps3.xml><?xml version="1.0" encoding="utf-8"?>
-<ds:datastoreItem xmlns:ds="http://schemas.openxmlformats.org/officeDocument/2006/customXml" ds:itemID="{5F1783E3-BA1C-4CA3-8E32-C9B378BBED03}">
+<ds:datastoreItem xmlns:ds="http://schemas.openxmlformats.org/officeDocument/2006/customXml" ds:itemID="{38798A93-35BB-4E36-97F5-7254B21EAFCC}">
   <ds:schemaRefs>
-    <ds:schemaRef ds:uri="http://purl.org/dc/terms/"/>
-    <ds:schemaRef ds:uri="http://purl.org/dc/dcmitype/"/>
-    <ds:schemaRef ds:uri="http://schemas.microsoft.com/office/2006/metadata/properties"/>
-    <ds:schemaRef ds:uri="http://www.w3.org/XML/1998/namespace"/>
-    <ds:schemaRef ds:uri="http://schemas.microsoft.com/office/2006/documentManagement/types"/>
-    <ds:schemaRef ds:uri="126e8a1c-9ea9-435a-ac89-d06c80d62e30"/>
-    <ds:schemaRef ds:uri="http://purl.org/dc/elements/1.1/"/>
-    <ds:schemaRef ds:uri="http://schemas.microsoft.com/office/infopath/2007/PartnerControls"/>
-    <ds:schemaRef ds:uri="http://schemas.openxmlformats.org/package/2006/metadata/core-properties"/>
+    <ds:schemaRef ds:uri="http://schemas.openxmlformats.org/officeDocument/2006/bibliography"/>
   </ds:schemaRefs>
 </ds:datastoreItem>
 </file>
 
 <file path=customXml/itemProps4.xml><?xml version="1.0" encoding="utf-8"?>
-<ds:datastoreItem xmlns:ds="http://schemas.openxmlformats.org/officeDocument/2006/customXml" ds:itemID="{38798A93-35BB-4E36-97F5-7254B21EAFCC}">
+<ds:datastoreItem xmlns:ds="http://schemas.openxmlformats.org/officeDocument/2006/customXml" ds:itemID="{5F1783E3-BA1C-4CA3-8E32-C9B378BBED03}">
   <ds:schemaRefs>
-    <ds:schemaRef ds:uri="http://schemas.openxmlformats.org/officeDocument/2006/bibliography"/>
+    <ds:schemaRef ds:uri="http://schemas.microsoft.com/office/2006/metadata/properties"/>
+    <ds:schemaRef ds:uri="http://schemas.microsoft.com/office/infopath/2007/PartnerControls"/>
   </ds:schemaRefs>
 </ds:datastoreItem>
 </file>
</xml_diff>